<commit_message>
feat: integrate ML models with final UI and add review-bomb monitoring
</commit_message>
<xml_diff>
--- a/docs/Multimodal_Fake_Review_and_Counterfeit_Detection_Paper.docx
+++ b/docs/Multimodal_Fake_Review_and_Counterfeit_Detection_Paper.docx
@@ -41,13 +41,14 @@
           <w:b/>
           <w:sz w:val="22"/>
         </w:rPr>
-        <w:t>Nayan Sharma¹  ·  Dr. Balamurugan R²</w:t>
+        <w:t xml:space="preserve">Nayan Sharma¹ </w:t>
       </w:r>
     </w:p>
     <w:p>
       <w:pPr>
         <w:spacing w:before="120" w:after="120"/>
       </w:pPr>
+      <w:proofErr w:type="gramStart"/>
       <w:r>
         <w:rPr>
           <w:b/>
@@ -58,13 +59,61 @@
         <w:rPr>
           <w:sz w:val="19"/>
         </w:rPr>
-        <w:t>The rapid proliferation of global electronic commerce platforms has been accompanied by a surge in deceptive merchant practices, most notably the dissemination of fabricated customer reviews and the proliferation of counterfeit merchandise. Conventional e-commerce integrity systems typically isolate textual sentiment evaluation from visual inspection or rely on unimodal classifiers vulnerable to domain shifts and adversarial manipulation. To address these vulnerabilities, this research concentrates on adopting an integrated, multimodal deep learning framework for automated counterfeit product detection and fake review identification. The proposed framework incorporates three specialized subsystems: (1) a dual-branch text-and-numerical neural network that combines a Bidirectional Long Short-Term Memory (BiLSTM) linguistic branch with a dense rating branch to identify fake reviews by capturing sentiment-rating discrepancies; (2) a deep sequential BiLSTM metadata authenticity classifier that evaluates structured product titles and catalog descriptions to detect illicit vocabulary patterns, keyword stuffing, and replica indicators; and (3) a visual similarity retrieval engine built on a fine-tuned ResNet-50 architecture where the 256-dimensional penultimate feature representations are extracted, L2-normalized, and indexed into an exact inner-product Facebook AI Similarity Search (FAISS) vector space across 1,848 genuine catalog references. To synthesize these signals without introducing brittle cross-modal bottlenecks, a Three-Signal Late Trust Fusion Engine computes an interpretable composite trust score by weighting the metadata authenticity score (0.50), the top-K visual brand match ratio (0.35), and the mean top-K nearest-neighbor retrieval similarity (0.15). Evaluated on real-world e-commerce benchmarks, the fake review detector achieves a test classification accuracy of 96.99% with an F1-score of 0.97. The visual retrieval engine delivers a 90.68% Top-1 and 93.95% Top-5 retrieval accuracy on unseen query footwear. Across diverse validation scenarios encompassing brand mismatches, unseen catalog queries, and explicit replica metadata, the late fusion engine achieves up to 100.00% counterfeit detection accuracy while maintaining high precision on authentic products (95.24%). The findings demonstrate that decoupling fine-grained visual metric retrieval from linguistic metadata classification—before unifying them through a constrained three-signal fusion function—provides a scalable, robust, and operationally viable defense for modern digital marketplaces.</w:t>
+        <w:t>The</w:t>
+      </w:r>
+      <w:proofErr w:type="gramEnd"/>
+      <w:r>
+        <w:rPr>
+          <w:sz w:val="19"/>
+        </w:rPr>
+        <w:t xml:space="preserve"> rapid proliferation of global electronic commerce platforms has been accompanied by a surge in deceptive merchant practices, most notably the dissemination of fabricated customer reviews and the proliferation of counterfeit merchandise. Conventional e-commerce integrity systems typically isolate textual sentiment evaluation from visual inspection or rely on unimodal classifiers vulnerable to domain shifts and adversarial manipulation. To address these vulnerabilities, this research concentrates on adopting an integrated, multimodal deep learning framework for automated counterfeit product detection and fake review identification. The proposed framework incorporates three specialized subsystems: (1) a dual-branch text-and-numerical neural network that combines a Bidirectional Long Short-Term Memory (</w:t>
+      </w:r>
+      <w:proofErr w:type="spellStart"/>
+      <w:r>
+        <w:rPr>
+          <w:sz w:val="19"/>
+        </w:rPr>
+        <w:t>BiLSTM</w:t>
+      </w:r>
+      <w:proofErr w:type="spellEnd"/>
+      <w:r>
+        <w:rPr>
+          <w:sz w:val="19"/>
+        </w:rPr>
+        <w:t xml:space="preserve">) linguistic branch with a dense rating branch to identify fake reviews by capturing sentiment-rating discrepancies; (2) a deep sequential </w:t>
+      </w:r>
+      <w:proofErr w:type="spellStart"/>
+      <w:r>
+        <w:rPr>
+          <w:sz w:val="19"/>
+        </w:rPr>
+        <w:t>BiLSTM</w:t>
+      </w:r>
+      <w:proofErr w:type="spellEnd"/>
+      <w:r>
+        <w:rPr>
+          <w:sz w:val="19"/>
+        </w:rPr>
+        <w:t xml:space="preserve"> metadata authenticity classifier that evaluates structured product titles and catalog descriptions to detect illicit vocabulary patterns, keyword stuffing, and replica indicators; and (3) a visual similarity retrieval engine built on a fine-tuned ResNet-50 architecture where the 256-dimensional penultimate feature representations are extracted, L2-normalized, and indexed into an exact inner-product Facebook AI Similarity Search (FAISS) vector space across 1,848 genuine catalog references. To synthesize these signals without introducing brittle cross-modal bottlenecks, a Three-Signal Late Trust Fusion Engine computes an interpretable composite trust score by weighting the metadata authenticity score (0.50), the top-K visual brand match ratio (0.35), and the mean top-K nearest-neighbor retrieval similarity (0.15). Evaluated on </w:t>
+      </w:r>
+      <w:r>
+        <w:rPr>
+          <w:sz w:val="19"/>
+        </w:rPr>
+        <w:t>curated</w:t>
+      </w:r>
+      <w:r>
+        <w:rPr>
+          <w:sz w:val="19"/>
+        </w:rPr>
+        <w:t xml:space="preserve"> e-commerce benchmarks, the fake review detector achieves a test classification accuracy of 96.99% with an F1-score of 0.97. The visual retrieval engine delivers a 90.68% Top-1 and 93.95% Top-5 retrieval accuracy on unseen query footwear. Across diverse validation scenarios encompassing brand mismatches, unseen catalog queries, and explicit replica metadata, the late fusion engine achieves up to 100.00% counterfeit detection accuracy while maintaining high precision on authentic products (95.24%). The findings demonstrate that decoupling fine-grained visual metric retrieval from linguistic metadata classification—before unifying them through a constrained three-signal fusion function—provides a scalable, robust, and operationally viable defense for modern digital marketplaces.</w:t>
       </w:r>
     </w:p>
     <w:p>
       <w:pPr>
         <w:spacing w:before="80" w:after="280"/>
       </w:pPr>
+      <w:proofErr w:type="gramStart"/>
       <w:r>
         <w:rPr>
           <w:b/>
@@ -76,7 +125,14 @@
         <w:rPr>
           <w:sz w:val="19"/>
         </w:rPr>
-        <w:t>Multimodal deep learning · Fake review detection · Counterfeit detection · Visual similarity retrieval · ResNet-50 · FAISS · Bidirectional LSTM · Late trust fusion · E-commerce security</w:t>
+        <w:t>Multimodal</w:t>
+      </w:r>
+      <w:proofErr w:type="gramEnd"/>
+      <w:r>
+        <w:rPr>
+          <w:sz w:val="19"/>
+        </w:rPr>
+        <w:t xml:space="preserve"> deep learning · Fake review detection · Counterfeit detection · Visual similarity retrieval · ResNet-50 · FAISS · Bidirectional LSTM · Late trust fusion · E-commerce security</w:t>
       </w:r>
     </w:p>
     <w:p>
@@ -126,14 +182,6 @@
         <w:br/>
         <w:t>¹ Department of Computer Science and Engineering, Advanced AI Systems Laboratory, VIT Vellore</w:t>
       </w:r>
-      <w:r>
-        <w:rPr>
-          <w:color w:val="5A5A5A"/>
-          <w:sz w:val="17"/>
-        </w:rPr>
-        <w:br/>
-        <w:t>² Department of Data Science and Machine Intelligence, VIT Vellore</w:t>
-      </w:r>
     </w:p>
     <w:p>
       <w:pPr>
@@ -150,16 +198,24 @@
     </w:p>
     <w:p>
       <w:r>
-        <w:t xml:space="preserve">With the vast advancements in artificial intelligence (AI) and cloud computing infrastructure, electronic commerce platforms have transformed global retail economics, international supply chains, and consumer purchasing behavior. Modern online marketplaces process millions of retail transactions daily, where consumer decisions rely fundamentally upon two primary sources of digital evidence: visual presentation (product imagery, studio catalogs, angles) and peer-generated social proof (customer reviews, textual feedback, and quantitative star ratings). However, </w:t>
+        <w:t xml:space="preserve">With the vast advancements in artificial intelligence (AI) and cloud computing infrastructure, electronic commerce platforms have transformed global retail economics, international supply chains, and consumer purchasing behavior. Modern online marketplaces process millions of retail transactions daily, where consumer decisions rely fundamentally upon two primary sources of digital evidence: visual presentation (product imagery, studio catalogs, angles) and peer-generated social proof (customer reviews, textual feedback, and quantitative star ratings). However, the democratization of open marketplace platforms has simultaneously enabled sophisticated adversarial actors to </w:t>
       </w:r>
       <w:r>
         <w:lastRenderedPageBreak/>
-        <w:t>the democratization of open marketplace platforms has simultaneously enabled sophisticated adversarial actors to deploy coordinated deceptive schemes. Chief among these fraudulent operations are the mass dissemination of fabricated customer reviews and the illicit listing of counterfeit commercial goods.</w:t>
+        <w:t>deploy coordinated deceptive schemes. Chief among these fraudulent operations are the mass dissemination of fabricated customer reviews and the illicit listing of counterfeit commercial goods.</w:t>
       </w:r>
     </w:p>
     <w:p>
       <w:r>
-        <w:t>Counterfeit products inflict severe multi-faceted harm on the global economic ecosystem. According to assessments by the Organisation for Economic Co-operation and Development (OECD) and intellectual property enforcement agencies, international trade in counterfeit goods accounts for hundreds of billions of dollars annually. Counterfeit merchandising not only damages the economic capital and brand reputations of legitimate manufacturers, but also directly imperils consumer safety through unregulated materials, poor structural integrity, and hazardous components. Concurrently, online opinion spam and fraudulent review campaigns fundamentally distort market mechanisms. Malicious merchants commission automated bot accounts and incentivized review syndicates to artificially inflate rating scores for substandard items, while conducting targeted smear campaigns against legitimate competitors. This toxic synergy between deceptive reviews and counterfeit listings degrades consumer trust and frustrates automated discovery algorithms.</w:t>
+        <w:t xml:space="preserve">Counterfeit products inflict severe multi-faceted harm on the global economic ecosystem. According to assessments by the </w:t>
+      </w:r>
+      <w:proofErr w:type="spellStart"/>
+      <w:r>
+        <w:t>Organisation</w:t>
+      </w:r>
+      <w:proofErr w:type="spellEnd"/>
+      <w:r>
+        <w:t xml:space="preserve"> for Economic Co-operation and Development (OECD) and intellectual property enforcement agencies, international trade in counterfeit goods accounts for hundreds of billions of dollars annually. Counterfeit merchandising not only damages the economic capital and brand reputations of legitimate manufacturers, but also directly imperils consumer safety through unregulated materials, poor structural integrity, and hazardous components. Concurrently, online opinion spam and fraudulent review campaigns fundamentally distort market mechanisms. Malicious merchants commission automated bot accounts and incentivized review syndicates to artificially inflate rating scores for substandard items, while conducting targeted smear campaigns against legitimate competitors. This toxic synergy between deceptive reviews and counterfeit listings degrades consumer trust and frustrates automated discovery algorithms.</w:t>
       </w:r>
     </w:p>
     <w:p>
@@ -191,7 +247,15 @@
         <w:t>2.</w:t>
       </w:r>
       <w:r>
-        <w:t xml:space="preserve"> To design a deep sequential BiLSTM metadata authenticity classifier capable of identifying deceptive syntax, keyword stuffing, and replica indicators within structured product titles.</w:t>
+        <w:t xml:space="preserve"> To design a deep sequential </w:t>
+      </w:r>
+      <w:proofErr w:type="spellStart"/>
+      <w:r>
+        <w:t>BiLSTM</w:t>
+      </w:r>
+      <w:proofErr w:type="spellEnd"/>
+      <w:r>
+        <w:t xml:space="preserve"> metadata authenticity classifier capable of identifying deceptive syntax, keyword stuffing, and replica indicators within structured product titles.</w:t>
       </w:r>
     </w:p>
     <w:p>
@@ -218,11 +282,11 @@
     </w:p>
     <w:p>
       <w:r>
-        <w:t xml:space="preserve">The remainder of this paper is organized as follows: Section 2 reviews existing literature in opinion spam detection, counterfeit image verification, and multimodal fusion to delineate current research gaps. Section 3 details the </w:t>
+        <w:t xml:space="preserve">The remainder of this paper is organized as follows: Section 2 reviews existing literature in opinion spam detection, counterfeit image verification, and multimodal fusion to delineate current research gaps. Section 3 details the comprehensive methodology, algorithms, network architectures, and mathematical formulations of the proposed </w:t>
       </w:r>
       <w:r>
         <w:lastRenderedPageBreak/>
-        <w:t>comprehensive methodology, algorithms, network architectures, and mathematical formulations of the proposed subsystems. Section 4 presents extensive experimental results, confusion matrices, retrieval evaluations, and operational scenario tests. Section 5 interprets the empirical findings and compares them against conventional baselines. Finally, Section 6 summarizes the research contributions, discusses constraints, and provides directions for future research.</w:t>
+        <w:t>subsystems. Section 4 presents extensive experimental results, confusion matrices, retrieval evaluations, and operational scenario tests. Section 5 interprets the empirical findings and compares them against conventional baselines. Finally, Section 6 summarizes the research contributions, discusses constraints, and provides directions for future research.</w:t>
       </w:r>
     </w:p>
     <w:p>
@@ -268,7 +332,15 @@
     </w:p>
     <w:p>
       <w:r>
-        <w:t>In commercial marketplaces, consumer reviews are inherently multi-faceted: textual narratives do not exist in isolation but are coupled with quantitative ratings, user transaction histories, and product-level signals. Prior studies highlight that reviewer behavioral patterns, temporal burstiness, and numerical ratings can provide complementary evidence to textual semantics (Mukherjee et al. 2013; Rayana and Akoglu 2015). When evaluating deceptive intent, incorporating numerical ratings alongside text sequences enables models to capture non-linear sentiment-rating discrepancies (for example, highly critical feedback paired with an anomalous 5-star rating, or effusive text accompanied by a punitive rating). Modeling this cross-attribute relationship motivates the dual-branch architecture implemented in this study.</w:t>
+        <w:t xml:space="preserve">In commercial marketplaces, consumer reviews are inherently multi-faceted: textual narratives do not exist in isolation but are coupled with quantitative ratings, user transaction histories, and product-level signals. Prior studies highlight that reviewer behavioral patterns, temporal burstiness, and numerical ratings can provide complementary evidence to textual semantics (Mukherjee et al. 2013; Rayana and </w:t>
+      </w:r>
+      <w:proofErr w:type="spellStart"/>
+      <w:r>
+        <w:t>Akoglu</w:t>
+      </w:r>
+      <w:proofErr w:type="spellEnd"/>
+      <w:r>
+        <w:t xml:space="preserve"> 2015). When evaluating deceptive intent, incorporating numerical ratings alongside text sequences enables models to capture non-linear sentiment-rating discrepancies (for example, highly critical feedback paired with an anomalous 5-star rating, or effusive text accompanied by a punitive rating). Modeling this cross-attribute relationship motivates the dual-branch architecture implemented in this study.</w:t>
       </w:r>
     </w:p>
     <w:p>
@@ -286,18 +358,74 @@
     </w:p>
     <w:p>
       <w:r>
-        <w:t>Visual inspection in e-commerce requires distinguishing genuine product variations (such as lighting shifts, perspectives, and seasonal colorways) from unauthorized copies that replicate gross silhouettes while deviating in fine details. Early visual retrieval approaches relied on handcrafted local descriptors such as Scale-Invariant Feature Transform (SIFT), Speeded-Up Robust Features (SURF), and Bag-of-Visual-Words (BoVW) frameworks. While effective for matching rigid objects under controlled illumination, these descriptors exhibit limited tolerance toward non-rigid fabric deformations, complex consumer backgrounds, and subtle stylistic differences common in commercial apparel and footwear.</w:t>
+        <w:t>Visual inspection in e-commerce requires distinguishing genuine product variations (such as lighting shifts, perspectives, and seasonal colorways) from unauthorized copies that replicate gross silhouettes while deviating in fine details. Early visual retrieval approaches relied on handcrafted local descriptors such as Scale-Invariant Feature Transform (SIFT), Speeded-Up Robust Features (SURF), and Bag-of-Visual-Words (</w:t>
+      </w:r>
+      <w:proofErr w:type="spellStart"/>
+      <w:r>
+        <w:t>BoVW</w:t>
+      </w:r>
+      <w:proofErr w:type="spellEnd"/>
+      <w:r>
+        <w:t>) frameworks. While effective for matching rigid objects under controlled illumination, these descriptors exhibit limited tolerance toward non-rigid fabric deformations, complex consumer backgrounds, and subtle stylistic differences common in commercial apparel and footwear.</w:t>
       </w:r>
     </w:p>
     <w:p>
       <w:r>
         <w:lastRenderedPageBreak/>
-        <w:t>The introduction of deep convolutional neural networks established deep representation learning as the standard for visual recognition. In particular, He et al. (2016) introduced deep residual learning (ResNet-50), utilizing identity skip connections to facilitate the optimization of deep feedforward networks without gradient degradation. In standard transfer-learning formulations, a convolutional backbone is fine-tuned to map inputs to a closed-set softmax classification layer. However, framing product authenticity verification strictly as a closed-set classifier presents a fundamental operational constraint: e-commerce platforms continuously encounter unindexed product models, novel colorways, and previously unseen brand variants. A closed-set classification head cannot output an embedding for an unindexed class without architectural alteration and complete retraining.</w:t>
+        <w:t xml:space="preserve">The introduction of deep convolutional neural networks established deep representation learning as the standard for visual recognition. In particular, He et al. (2016) introduced deep residual learning (ResNet-50), utilizing identity skip connections to facilitate the optimization of deep feedforward networks without gradient degradation. In standard transfer-learning formulations, a convolutional backbone is fine-tuned to map inputs to a closed-set </w:t>
+      </w:r>
+      <w:proofErr w:type="spellStart"/>
+      <w:r>
+        <w:t>softmax</w:t>
+      </w:r>
+      <w:proofErr w:type="spellEnd"/>
+      <w:r>
+        <w:t xml:space="preserve"> classification layer. However, framing product authenticity verification strictly as a closed-set classifier presents a fundamental operational constraint: e-commerce platforms continuously encounter unindexed product models, novel colorways, and previously unseen brand variants. A closed-set classification head cannot output </w:t>
+      </w:r>
+      <w:proofErr w:type="spellStart"/>
+      <w:r>
+        <w:t>an</w:t>
+      </w:r>
+      <w:proofErr w:type="spellEnd"/>
+      <w:r>
+        <w:t xml:space="preserve"> embedding for an unindexed class without architectural alteration and complete retraining.</w:t>
       </w:r>
     </w:p>
     <w:p>
       <w:r>
-        <w:t>To achieve open-world verification, visual representation learning coupled with nearest-neighbor retrieval has emerged as a scalable alternative. Liu et al. (2016) demonstrated on the large-scale DeepFashion benchmark that deep visual-semantic embeddings could power consumer-to-shop visual clothing retrieval, achieving a Top-20 retrieval accuracy of 65.6%. In this paradigm, intermediate network activations serve as continuous visual descriptors, and similarity is evaluated by distance metrics relative to authenticated gallery references. To support scalable indexing across high-dimensional vector spaces, Johnson, Douze, and Jégou (2021) introduced Facebook AI Similarity Search (FAISS), enabling exact and compressed nearest-neighbor search for high-dimensional vectors. In TrustNet's visual pipeline, an input image is processed through a fine-tuned ResNet-50 backbone, where the 256-dimensional penultimate-layer representation is extracted, L2-normalized, and indexed using FAISS IndexFlatIP over 1,848 authenticated catalog vectors to execute Top-K cosine similarity retrieval. The 6-class softmax head employed during pre-training is detached after training and is neither used as the retrieval embedding nor supplied as a fusion signal.</w:t>
+        <w:t xml:space="preserve">To achieve open-world verification, visual representation learning coupled with nearest-neighbor retrieval has emerged as a scalable alternative. Liu et al. (2016) demonstrated on the large-scale </w:t>
+      </w:r>
+      <w:proofErr w:type="spellStart"/>
+      <w:r>
+        <w:t>DeepFashion</w:t>
+      </w:r>
+      <w:proofErr w:type="spellEnd"/>
+      <w:r>
+        <w:t xml:space="preserve"> benchmark that deep visual-semantic embeddings could power consumer-to-shop visual clothing retrieval, achieving a Top-20 retrieval accuracy of 65.6%. In this paradigm, intermediate network activations serve as continuous visual descriptors, and similarity is evaluated by distance metrics relative to authenticated gallery references. To support scalable indexing across high-dimensional vector spaces, Johnson, </w:t>
+      </w:r>
+      <w:proofErr w:type="spellStart"/>
+      <w:r>
+        <w:t>Douze</w:t>
+      </w:r>
+      <w:proofErr w:type="spellEnd"/>
+      <w:r>
+        <w:t xml:space="preserve">, and Jégou (2021) introduced Facebook AI Similarity Search (FAISS), enabling exact and compressed nearest-neighbor search for high-dimensional vectors. In TrustNet's visual pipeline, an input image is processed through a fine-tuned ResNet-50 backbone, where the 256-dimensional penultimate-layer representation is extracted, L2-normalized, and indexed using FAISS </w:t>
+      </w:r>
+      <w:proofErr w:type="spellStart"/>
+      <w:r>
+        <w:t>IndexFlatIP</w:t>
+      </w:r>
+      <w:proofErr w:type="spellEnd"/>
+      <w:r>
+        <w:t xml:space="preserve"> over 1,848 authenticated catalog vectors to execute Top-K cosine similarity retrieval. The 6-class </w:t>
+      </w:r>
+      <w:proofErr w:type="spellStart"/>
+      <w:r>
+        <w:t>softmax</w:t>
+      </w:r>
+      <w:proofErr w:type="spellEnd"/>
+      <w:r>
+        <w:t xml:space="preserve"> head employed during pre-training is detached after training and is neither used as the retrieval embedding nor supplied as a fusion signal.</w:t>
       </w:r>
     </w:p>
     <w:p>
@@ -315,17 +443,73 @@
     </w:p>
     <w:p>
       <w:r>
-        <w:t>Because fraudulent merchants can manipulate text, ratings, or images independently, robust marketplace auditing necessitates multimodal synthesis. As categorized in the comprehensive taxonomy by Baltrušaitis, Ahuja, and Morency (2019), multimodal fusion strategies typically fall into early, intermediate, and late paradigms. Early fusion concatenates raw or shallow feature vectors at the input stage, which can complicate gradient propagation when modalities exhibit substantially differing dimensionalities and noise characteristics. Intermediate (joint) fusion uses shared latent layers or cross-modal attention mechanisms; while capable of modeling intricate cross-modal interactions, joint encoders typically require large, tightly synchronized multimodal training pairs and exhibit higher computational overhead during training.</w:t>
+        <w:t xml:space="preserve">Because fraudulent merchants can manipulate text, ratings, or images independently, robust marketplace auditing necessitates multimodal synthesis. As categorized in the comprehensive taxonomy by </w:t>
+      </w:r>
+      <w:proofErr w:type="spellStart"/>
+      <w:r>
+        <w:t>Baltrušaitis</w:t>
+      </w:r>
+      <w:proofErr w:type="spellEnd"/>
+      <w:r>
+        <w:t>, Ahuja, and Morency (2019), multimodal fusion strategies typically fall into early, intermediate, and late paradigms. Early fusion concatenates raw or shallow feature vectors at the input stage, which can complicate gradient propagation when modalities exhibit substantially differing dimensionalities and noise characteristics. Intermediate (joint) fusion uses shared latent layers or cross-modal attention mechanisms; while capable of modeling intricate cross-modal interactions, joint encoders typically require large, tightly synchronized multimodal training pairs and exhibit higher computational overhead during training.</w:t>
       </w:r>
     </w:p>
     <w:p>
       <w:r>
-        <w:t>Late fusion (decision-level integration) combines predictions or confidence scores from independent unimodal models. For practical marketplace auditing, late fusion offers several distinct advantages: (1) it preserves modality-specific architectural specialization, allowing sequence models (BiLSTM) and convolutional metric extractors (ResNet-50) to be optimized under their respective objective functions; (2) it decouples inference dependencies, enabling the visual catalog in the FAISS index to be expanded dynamically without retraining the text classifiers; (3) it provides transparent visibility into the contribution of each individual modality, enabling interpretable compliance auditing; and (4) it isolates single-modality data corruption from destabilizing the overall feature space.</w:t>
+        <w:t>Late fusion (decision-level integration) combines predictions or confidence scores from independent unimodal models. For practical marketplace auditing, late fusion offers several distinct advantages: (1) it preserves modality-specific architectural specialization, allowing sequence models (</w:t>
+      </w:r>
+      <w:proofErr w:type="spellStart"/>
+      <w:r>
+        <w:t>BiLSTM</w:t>
+      </w:r>
+      <w:proofErr w:type="spellEnd"/>
+      <w:r>
+        <w:t>) and convolutional metric extractors (ResNet-50) to be optimized under their respective objective functions; (2) it decouples inference dependencies, enabling the visual catalog in the FAISS index to be expanded dynamically without retraining the text classifiers; (3) it provides transparent visibility into the contribution of each individual modality, enabling interpretable compliance auditing; and (4) it isolates single-modality data corruption from destabilizing the overall feature space.</w:t>
       </w:r>
     </w:p>
     <w:p>
       <w:r>
-        <w:t>In TrustNet, this late fusion framework integrates exactly three signals: (i) the metadata authenticity score (S_meta), (ii) the visual Brand Match Ratio (R_brand) derived from the top-K retrieved catalog neighbors, and (iii) the mean top-K retrieval similarity (C_ret). The brand classifier's 6-dimensional softmax probability vector is explicitly excluded from the fusion function.</w:t>
+        <w:t>In TrustNet, this late fusion framework integrates exactly three signals: (</w:t>
+      </w:r>
+      <w:proofErr w:type="spellStart"/>
+      <w:r>
+        <w:t>i</w:t>
+      </w:r>
+      <w:proofErr w:type="spellEnd"/>
+      <w:r>
+        <w:t>) the metadata authenticity score (</w:t>
+      </w:r>
+      <w:proofErr w:type="spellStart"/>
+      <w:r>
+        <w:t>S_meta</w:t>
+      </w:r>
+      <w:proofErr w:type="spellEnd"/>
+      <w:r>
+        <w:t>), (ii) the visual Brand Match Ratio (</w:t>
+      </w:r>
+      <w:proofErr w:type="spellStart"/>
+      <w:r>
+        <w:t>R_brand</w:t>
+      </w:r>
+      <w:proofErr w:type="spellEnd"/>
+      <w:r>
+        <w:t>) derived from the top-K retrieved catalog neighbors, and (iii) the mean top-K retrieval similarity (</w:t>
+      </w:r>
+      <w:proofErr w:type="spellStart"/>
+      <w:r>
+        <w:t>C_ret</w:t>
+      </w:r>
+      <w:proofErr w:type="spellEnd"/>
+      <w:r>
+        <w:t xml:space="preserve">). The brand classifier's 6-dimensional </w:t>
+      </w:r>
+      <w:proofErr w:type="spellStart"/>
+      <w:r>
+        <w:t>softmax</w:t>
+      </w:r>
+      <w:proofErr w:type="spellEnd"/>
+      <w:r>
+        <w:t xml:space="preserve"> probability vector is explicitly excluded from the fusion function.</w:t>
       </w:r>
     </w:p>
     <w:p>
@@ -889,11 +1073,33 @@
               <w:spacing w:before="40" w:after="40" w:line="240" w:lineRule="auto"/>
               <w:jc w:val="left"/>
             </w:pPr>
-            <w:r>
-              <w:rPr>
-                <w:sz w:val="17"/>
-              </w:rPr>
-              <w:t>DeepFashion (FashionNet) learning visual-semantic embeddings for clothes retrieval</w:t>
+            <w:proofErr w:type="spellStart"/>
+            <w:r>
+              <w:rPr>
+                <w:sz w:val="17"/>
+              </w:rPr>
+              <w:t>DeepFashion</w:t>
+            </w:r>
+            <w:proofErr w:type="spellEnd"/>
+            <w:r>
+              <w:rPr>
+                <w:sz w:val="17"/>
+              </w:rPr>
+              <w:t xml:space="preserve"> (</w:t>
+            </w:r>
+            <w:proofErr w:type="spellStart"/>
+            <w:r>
+              <w:rPr>
+                <w:sz w:val="17"/>
+              </w:rPr>
+              <w:t>FashionNet</w:t>
+            </w:r>
+            <w:proofErr w:type="spellEnd"/>
+            <w:r>
+              <w:rPr>
+                <w:sz w:val="17"/>
+              </w:rPr>
+              <w:t>) learning visual-semantic embeddings for clothes retrieval</w:t>
             </w:r>
           </w:p>
         </w:tc>
@@ -1000,7 +1206,35 @@
               <w:rPr>
                 <w:sz w:val="17"/>
               </w:rPr>
-              <w:t>Dual-Branch BiLSTM + Sequential BiLSTM metadata classifier + Fine-Tuned ResNet-50 256-D FAISS + Three-Signal Late Trust Fusion</w:t>
+              <w:t xml:space="preserve">Dual-Branch </w:t>
+            </w:r>
+            <w:proofErr w:type="spellStart"/>
+            <w:r>
+              <w:rPr>
+                <w:sz w:val="17"/>
+              </w:rPr>
+              <w:t>BiLSTM</w:t>
+            </w:r>
+            <w:proofErr w:type="spellEnd"/>
+            <w:r>
+              <w:rPr>
+                <w:sz w:val="17"/>
+              </w:rPr>
+              <w:t xml:space="preserve"> + Sequential </w:t>
+            </w:r>
+            <w:proofErr w:type="spellStart"/>
+            <w:r>
+              <w:rPr>
+                <w:sz w:val="17"/>
+              </w:rPr>
+              <w:t>BiLSTM</w:t>
+            </w:r>
+            <w:proofErr w:type="spellEnd"/>
+            <w:r>
+              <w:rPr>
+                <w:sz w:val="17"/>
+              </w:rPr>
+              <w:t xml:space="preserve"> metadata classifier + Fine-Tuned ResNet-50 256-D FAISS + Three-Signal Late Trust Fusion</w:t>
             </w:r>
           </w:p>
         </w:tc>
@@ -1042,7 +1276,7 @@
     </w:tbl>
     <w:p>
       <w:pPr>
-        <w:spacing w:after="40" w:before="40"/>
+        <w:spacing w:before="40" w:after="40"/>
       </w:pPr>
     </w:p>
     <w:p>
@@ -1076,7 +1310,15 @@
         <w:spacing w:after="40"/>
       </w:pPr>
       <w:r>
-        <w:t xml:space="preserve"> (2) Sequential BiLSTM Metadata Authenticity Classifier;</w:t>
+        <w:t xml:space="preserve"> (2) Sequential </w:t>
+      </w:r>
+      <w:proofErr w:type="spellStart"/>
+      <w:r>
+        <w:t>BiLSTM</w:t>
+      </w:r>
+      <w:proofErr w:type="spellEnd"/>
+      <w:r>
+        <w:t xml:space="preserve"> Metadata Authenticity Classifier;</w:t>
       </w:r>
     </w:p>
     <w:p>
@@ -1084,7 +1326,15 @@
         <w:spacing w:after="40"/>
       </w:pPr>
       <w:r>
-        <w:t xml:space="preserve"> (3) Fine-Tuned ResNet-50 Visual Similarity Retrieval Engine with FAISS IndexFlatIP;</w:t>
+        <w:t xml:space="preserve"> (3) Fine-Tuned ResNet-50 Visual Similarity Retrieval Engine with FAISS </w:t>
+      </w:r>
+      <w:proofErr w:type="spellStart"/>
+      <w:r>
+        <w:t>IndexFlatIP</w:t>
+      </w:r>
+      <w:proofErr w:type="spellEnd"/>
+      <w:r>
+        <w:t>;</w:t>
       </w:r>
     </w:p>
     <w:p>
@@ -1115,7 +1365,15 @@
     </w:p>
     <w:p>
       <w:r>
-        <w:t>1. E-Commerce Review Dataset (shoes_reviews.csv): A corpus of 1,821 customer reviews comprising authentic user feedback (label 0, N=968) and verified fake/incentivized reviews (label 1, N=853). The dataset includes raw text passages along with numerical star ratings (1 to 5). The corpus was partitioned into an 80:20 stratified split yielding 1,456 training samples and 365 test samples. Text passages were cleaned via regex normalization, lowercased, and converted into token index sequences using a Keras Tokenizer (vocabulary capacity |V|=10,000, resulting in 3,529 unique vocabulary tokens). The mean sequence length was 31.94 words with a maximum of 393 words. Sequences were standardized to a fixed length of 120 words via post-padding and truncation.</w:t>
+        <w:t xml:space="preserve">1. E-Commerce Review Dataset (shoes_reviews.csv): A corpus of 1,821 customer reviews comprising authentic user feedback (label 0, N=968) and verified fake/incentivized reviews (label 1, N=853). The dataset includes raw text passages along with numerical star ratings (1 to 5). The corpus was partitioned into an 80:20 stratified split yielding 1,456 training samples and 365 test samples. Text passages were cleaned via regex normalization, lowercased, and converted into token index sequences using a </w:t>
+      </w:r>
+      <w:proofErr w:type="spellStart"/>
+      <w:r>
+        <w:t>Keras</w:t>
+      </w:r>
+      <w:proofErr w:type="spellEnd"/>
+      <w:r>
+        <w:t xml:space="preserve"> Tokenizer (vocabulary capacity |V|=10,000, resulting in 3,529 unique vocabulary tokens). The mean sequence length was 31.94 words with a maximum of 393 words. Sequences were standardized to a fixed length of 120 words via post-padding and truncation.</w:t>
       </w:r>
     </w:p>
     <w:p>
@@ -1126,7 +1384,15 @@
     </w:p>
     <w:p>
       <w:r>
-        <w:t>3. Retail Sneaker Visual Catalog (sampled_sneakers_1024x1024): A curated database of 2,642 high-resolution footwear product images spanning six prominent footwear brands: New Balance (226), Nike (379), Puma (547), Reebok (341), Under Armour (230), and Vans (919). The dataset was partitioned into 1,848 training images (70%), 397 validation images (15%), and 397 test query images (15%). Images were resized to 224x224x3 and normalized via ImageNet channel mean subtraction.</w:t>
+        <w:t xml:space="preserve">3. Retail Sneaker Visual Catalog (sampled_sneakers_1024x1024): A curated database of 2,642 high-resolution footwear product images spanning six prominent footwear brands: New Balance (226), Nike (379), Puma (547), Reebok (341), Under </w:t>
+      </w:r>
+      <w:proofErr w:type="spellStart"/>
+      <w:r>
+        <w:t>Armour</w:t>
+      </w:r>
+      <w:proofErr w:type="spellEnd"/>
+      <w:r>
+        <w:t xml:space="preserve"> (230), and Vans (919). The dataset was partitioned into 1,848 training images (70%), 397 validation images (15%), and 397 test query images (15%). Images were resized to 224x224x3 and normalized via ImageNet channel mean subtraction.</w:t>
       </w:r>
     </w:p>
     <w:p>
@@ -1144,7 +1410,39 @@
     </w:p>
     <w:p>
       <w:r>
-        <w:t>The Fake Review Detector architecture simultaneously models the semantic contents of customer feedback and quantitative rating signals to capture sentiment-rating divergence. Let w = [w_1, w_2, ..., w_T] denote the padded sequence of review tokens (T=120). Each word index is projected into a dense vector space via an embedding matrix E in R^(|V| x d_e), where d_e = 128:</w:t>
+        <w:t xml:space="preserve">The Fake Review Detector architecture simultaneously models the semantic contents of customer feedback and quantitative rating signals to capture sentiment-rating divergence. Let w = [w_1, w_2, ..., </w:t>
+      </w:r>
+      <w:proofErr w:type="spellStart"/>
+      <w:r>
+        <w:t>w_T</w:t>
+      </w:r>
+      <w:proofErr w:type="spellEnd"/>
+      <w:r>
+        <w:t>] denote the padded sequence of review tokens (T=120). Each word index is projected into a dense vector space via an embedding matrix E in R</w:t>
+      </w:r>
+      <w:proofErr w:type="gramStart"/>
+      <w:r>
+        <w:t>^(</w:t>
+      </w:r>
+      <w:proofErr w:type="gramEnd"/>
+      <w:r>
+        <w:t xml:space="preserve">|V| x </w:t>
+      </w:r>
+      <w:proofErr w:type="spellStart"/>
+      <w:r>
+        <w:t>d_e</w:t>
+      </w:r>
+      <w:proofErr w:type="spellEnd"/>
+      <w:r>
+        <w:t xml:space="preserve">), where </w:t>
+      </w:r>
+      <w:proofErr w:type="spellStart"/>
+      <w:r>
+        <w:t>d_e</w:t>
+      </w:r>
+      <w:proofErr w:type="spellEnd"/>
+      <w:r>
+        <w:t xml:space="preserve"> = 128:</w:t>
       </w:r>
     </w:p>
     <w:tbl>
@@ -1172,22 +1470,26 @@
               <w:jc w:val="center"/>
             </w:pPr>
             <w:r>
+              <w:rPr>
+                <w:noProof/>
+              </w:rPr>
               <w:drawing>
-                <wp:inline xmlns:a="http://schemas.openxmlformats.org/drawingml/2006/main" xmlns:pic="http://schemas.openxmlformats.org/drawingml/2006/picture">
+                <wp:inline distT="0" distB="0" distL="0" distR="0" wp14:anchorId="72B28643" wp14:editId="45D5B159">
                   <wp:extent cx="4983480" cy="666814"/>
+                  <wp:effectExtent l="0" t="0" r="0" b="0"/>
                   <wp:docPr id="6" name="Picture 6"/>
                   <wp:cNvGraphicFramePr>
-                    <a:graphicFrameLocks noChangeAspect="1"/>
+                    <a:graphicFrameLocks xmlns:a="http://schemas.openxmlformats.org/drawingml/2006/main" noChangeAspect="1"/>
                   </wp:cNvGraphicFramePr>
-                  <a:graphic>
+                  <a:graphic xmlns:a="http://schemas.openxmlformats.org/drawingml/2006/main">
                     <a:graphicData uri="http://schemas.openxmlformats.org/drawingml/2006/picture">
-                      <pic:pic>
+                      <pic:pic xmlns:pic="http://schemas.openxmlformats.org/drawingml/2006/picture">
                         <pic:nvPicPr>
                           <pic:cNvPr id="0" name="eq_01.png"/>
                           <pic:cNvPicPr/>
                         </pic:nvPicPr>
                         <pic:blipFill>
-                          <a:blip r:embed="rId13"/>
+                          <a:blip r:embed="rId6"/>
                           <a:stretch>
                             <a:fillRect/>
                           </a:stretch>
@@ -1197,7 +1499,9 @@
                             <a:off x="0" y="0"/>
                             <a:ext cx="4983480" cy="666814"/>
                           </a:xfrm>
-                          <a:prstGeom prst="rect"/>
+                          <a:prstGeom prst="rect">
+                            <a:avLst/>
+                          </a:prstGeom>
                         </pic:spPr>
                       </pic:pic>
                     </a:graphicData>
@@ -1217,10 +1521,6 @@
               <w:jc w:val="right"/>
             </w:pPr>
             <w:r>
-              <w:rPr>
-                <w:rFonts w:ascii="Times New Roman" w:hAnsi="Times New Roman"/>
-                <w:sz w:val="20"/>
-              </w:rPr>
               <w:t>(1)</w:t>
             </w:r>
           </w:p>
@@ -1229,12 +1529,20 @@
     </w:tbl>
     <w:p>
       <w:pPr>
-        <w:spacing w:after="40" w:before="40"/>
+        <w:spacing w:before="40" w:after="40"/>
       </w:pPr>
     </w:p>
     <w:p>
       <w:r>
-        <w:t>The embedded sequence is fed into a Bidirectional LSTM (BiLSTM) with 64 units per direction and a dropout rate of 0.3. The forward LSTM computes hidden states from t=1 to T, while the backward LSTM processes the reverse sequence from t=T to 1:</w:t>
+        <w:t>The embedded sequence is fed into a Bidirectional LSTM (</w:t>
+      </w:r>
+      <w:proofErr w:type="spellStart"/>
+      <w:r>
+        <w:t>BiLSTM</w:t>
+      </w:r>
+      <w:proofErr w:type="spellEnd"/>
+      <w:r>
+        <w:t>) with 64 units per direction and a dropout rate of 0.3. The forward LSTM computes hidden states from t=1 to T, while the backward LSTM processes the reverse sequence from t=T to 1:</w:t>
       </w:r>
     </w:p>
     <w:tbl>
@@ -1262,22 +1570,26 @@
               <w:jc w:val="center"/>
             </w:pPr>
             <w:r>
+              <w:rPr>
+                <w:noProof/>
+              </w:rPr>
               <w:drawing>
-                <wp:inline xmlns:a="http://schemas.openxmlformats.org/drawingml/2006/main" xmlns:pic="http://schemas.openxmlformats.org/drawingml/2006/picture">
+                <wp:inline distT="0" distB="0" distL="0" distR="0" wp14:anchorId="32018AA9" wp14:editId="00313B62">
                   <wp:extent cx="4983480" cy="666814"/>
+                  <wp:effectExtent l="0" t="0" r="0" b="0"/>
                   <wp:docPr id="7" name="Picture 7"/>
                   <wp:cNvGraphicFramePr>
-                    <a:graphicFrameLocks noChangeAspect="1"/>
+                    <a:graphicFrameLocks xmlns:a="http://schemas.openxmlformats.org/drawingml/2006/main" noChangeAspect="1"/>
                   </wp:cNvGraphicFramePr>
-                  <a:graphic>
+                  <a:graphic xmlns:a="http://schemas.openxmlformats.org/drawingml/2006/main">
                     <a:graphicData uri="http://schemas.openxmlformats.org/drawingml/2006/picture">
-                      <pic:pic>
+                      <pic:pic xmlns:pic="http://schemas.openxmlformats.org/drawingml/2006/picture">
                         <pic:nvPicPr>
                           <pic:cNvPr id="0" name="eq_02.png"/>
                           <pic:cNvPicPr/>
                         </pic:nvPicPr>
                         <pic:blipFill>
-                          <a:blip r:embed="rId14"/>
+                          <a:blip r:embed="rId7"/>
                           <a:stretch>
                             <a:fillRect/>
                           </a:stretch>
@@ -1287,7 +1599,9 @@
                             <a:off x="0" y="0"/>
                             <a:ext cx="4983480" cy="666814"/>
                           </a:xfrm>
-                          <a:prstGeom prst="rect"/>
+                          <a:prstGeom prst="rect">
+                            <a:avLst/>
+                          </a:prstGeom>
                         </pic:spPr>
                       </pic:pic>
                     </a:graphicData>
@@ -1307,10 +1621,6 @@
               <w:jc w:val="right"/>
             </w:pPr>
             <w:r>
-              <w:rPr>
-                <w:rFonts w:ascii="Times New Roman" w:hAnsi="Times New Roman"/>
-                <w:sz w:val="20"/>
-              </w:rPr>
               <w:t>(2)</w:t>
             </w:r>
           </w:p>
@@ -1319,7 +1629,7 @@
     </w:tbl>
     <w:p>
       <w:pPr>
-        <w:spacing w:after="40" w:before="40"/>
+        <w:spacing w:before="40" w:after="40"/>
       </w:pPr>
     </w:p>
     <w:tbl>
@@ -1347,22 +1657,26 @@
               <w:jc w:val="center"/>
             </w:pPr>
             <w:r>
+              <w:rPr>
+                <w:noProof/>
+              </w:rPr>
               <w:drawing>
-                <wp:inline xmlns:a="http://schemas.openxmlformats.org/drawingml/2006/main" xmlns:pic="http://schemas.openxmlformats.org/drawingml/2006/picture">
+                <wp:inline distT="0" distB="0" distL="0" distR="0" wp14:anchorId="7BBFC4BD" wp14:editId="06EB71F6">
                   <wp:extent cx="4983480" cy="666814"/>
+                  <wp:effectExtent l="0" t="0" r="0" b="0"/>
                   <wp:docPr id="8" name="Picture 8"/>
                   <wp:cNvGraphicFramePr>
-                    <a:graphicFrameLocks noChangeAspect="1"/>
+                    <a:graphicFrameLocks xmlns:a="http://schemas.openxmlformats.org/drawingml/2006/main" noChangeAspect="1"/>
                   </wp:cNvGraphicFramePr>
-                  <a:graphic>
+                  <a:graphic xmlns:a="http://schemas.openxmlformats.org/drawingml/2006/main">
                     <a:graphicData uri="http://schemas.openxmlformats.org/drawingml/2006/picture">
-                      <pic:pic>
+                      <pic:pic xmlns:pic="http://schemas.openxmlformats.org/drawingml/2006/picture">
                         <pic:nvPicPr>
                           <pic:cNvPr id="0" name="eq_03.png"/>
                           <pic:cNvPicPr/>
                         </pic:nvPicPr>
                         <pic:blipFill>
-                          <a:blip r:embed="rId15"/>
+                          <a:blip r:embed="rId8"/>
                           <a:stretch>
                             <a:fillRect/>
                           </a:stretch>
@@ -1372,7 +1686,9 @@
                             <a:off x="0" y="0"/>
                             <a:ext cx="4983480" cy="666814"/>
                           </a:xfrm>
-                          <a:prstGeom prst="rect"/>
+                          <a:prstGeom prst="rect">
+                            <a:avLst/>
+                          </a:prstGeom>
                         </pic:spPr>
                       </pic:pic>
                     </a:graphicData>
@@ -1392,10 +1708,6 @@
               <w:jc w:val="right"/>
             </w:pPr>
             <w:r>
-              <w:rPr>
-                <w:rFonts w:ascii="Times New Roman" w:hAnsi="Times New Roman"/>
-                <w:sz w:val="20"/>
-              </w:rPr>
               <w:t>(3)</w:t>
             </w:r>
           </w:p>
@@ -1404,12 +1716,28 @@
     </w:tbl>
     <w:p>
       <w:pPr>
-        <w:spacing w:after="40" w:before="40"/>
+        <w:spacing w:before="40" w:after="40"/>
       </w:pPr>
     </w:p>
     <w:p>
       <w:r>
-        <w:t>The final bidirectional hidden representations are concatenated to form a 128-dimensional context vector h_T = [h_fwd_T || h_bwd_1], which is projected through a dense layer:</w:t>
+        <w:t xml:space="preserve">The final bidirectional hidden representations are concatenated to form a 128-dimensional context vector </w:t>
+      </w:r>
+      <w:proofErr w:type="spellStart"/>
+      <w:r>
+        <w:t>h_T</w:t>
+      </w:r>
+      <w:proofErr w:type="spellEnd"/>
+      <w:r>
+        <w:t xml:space="preserve"> = [</w:t>
+      </w:r>
+      <w:proofErr w:type="spellStart"/>
+      <w:r>
+        <w:t>h_fwd_T</w:t>
+      </w:r>
+      <w:proofErr w:type="spellEnd"/>
+      <w:r>
+        <w:t xml:space="preserve"> || h_bwd_1], which is projected through a dense layer:</w:t>
       </w:r>
     </w:p>
     <w:tbl>
@@ -1437,22 +1765,26 @@
               <w:jc w:val="center"/>
             </w:pPr>
             <w:r>
+              <w:rPr>
+                <w:noProof/>
+              </w:rPr>
               <w:drawing>
-                <wp:inline xmlns:a="http://schemas.openxmlformats.org/drawingml/2006/main" xmlns:pic="http://schemas.openxmlformats.org/drawingml/2006/picture">
+                <wp:inline distT="0" distB="0" distL="0" distR="0" wp14:anchorId="117FB06E" wp14:editId="6AA01911">
                   <wp:extent cx="4983480" cy="666814"/>
+                  <wp:effectExtent l="0" t="0" r="0" b="0"/>
                   <wp:docPr id="9" name="Picture 9"/>
                   <wp:cNvGraphicFramePr>
-                    <a:graphicFrameLocks noChangeAspect="1"/>
+                    <a:graphicFrameLocks xmlns:a="http://schemas.openxmlformats.org/drawingml/2006/main" noChangeAspect="1"/>
                   </wp:cNvGraphicFramePr>
-                  <a:graphic>
+                  <a:graphic xmlns:a="http://schemas.openxmlformats.org/drawingml/2006/main">
                     <a:graphicData uri="http://schemas.openxmlformats.org/drawingml/2006/picture">
-                      <pic:pic>
+                      <pic:pic xmlns:pic="http://schemas.openxmlformats.org/drawingml/2006/picture">
                         <pic:nvPicPr>
                           <pic:cNvPr id="0" name="eq_04.png"/>
                           <pic:cNvPicPr/>
                         </pic:nvPicPr>
                         <pic:blipFill>
-                          <a:blip r:embed="rId16"/>
+                          <a:blip r:embed="rId9"/>
                           <a:stretch>
                             <a:fillRect/>
                           </a:stretch>
@@ -1462,7 +1794,9 @@
                             <a:off x="0" y="0"/>
                             <a:ext cx="4983480" cy="666814"/>
                           </a:xfrm>
-                          <a:prstGeom prst="rect"/>
+                          <a:prstGeom prst="rect">
+                            <a:avLst/>
+                          </a:prstGeom>
                         </pic:spPr>
                       </pic:pic>
                     </a:graphicData>
@@ -1482,10 +1816,6 @@
               <w:jc w:val="right"/>
             </w:pPr>
             <w:r>
-              <w:rPr>
-                <w:rFonts w:ascii="Times New Roman" w:hAnsi="Times New Roman"/>
-                <w:sz w:val="20"/>
-              </w:rPr>
               <w:t>(4)</w:t>
             </w:r>
           </w:p>
@@ -1494,7 +1824,7 @@
     </w:tbl>
     <w:p>
       <w:pPr>
-        <w:spacing w:after="40" w:before="40"/>
+        <w:spacing w:before="40" w:after="40"/>
       </w:pPr>
     </w:p>
     <w:p>
@@ -1527,22 +1857,27 @@
               <w:jc w:val="center"/>
             </w:pPr>
             <w:r>
+              <w:rPr>
+                <w:noProof/>
+              </w:rPr>
+              <w:lastRenderedPageBreak/>
               <w:drawing>
-                <wp:inline xmlns:a="http://schemas.openxmlformats.org/drawingml/2006/main" xmlns:pic="http://schemas.openxmlformats.org/drawingml/2006/picture">
+                <wp:inline distT="0" distB="0" distL="0" distR="0" wp14:anchorId="1AEE885B" wp14:editId="4BF1C31B">
                   <wp:extent cx="4983480" cy="666814"/>
+                  <wp:effectExtent l="0" t="0" r="0" b="0"/>
                   <wp:docPr id="10" name="Picture 10"/>
                   <wp:cNvGraphicFramePr>
-                    <a:graphicFrameLocks noChangeAspect="1"/>
+                    <a:graphicFrameLocks xmlns:a="http://schemas.openxmlformats.org/drawingml/2006/main" noChangeAspect="1"/>
                   </wp:cNvGraphicFramePr>
-                  <a:graphic>
+                  <a:graphic xmlns:a="http://schemas.openxmlformats.org/drawingml/2006/main">
                     <a:graphicData uri="http://schemas.openxmlformats.org/drawingml/2006/picture">
-                      <pic:pic>
+                      <pic:pic xmlns:pic="http://schemas.openxmlformats.org/drawingml/2006/picture">
                         <pic:nvPicPr>
                           <pic:cNvPr id="0" name="eq_05.png"/>
                           <pic:cNvPicPr/>
                         </pic:nvPicPr>
                         <pic:blipFill>
-                          <a:blip r:embed="rId17"/>
+                          <a:blip r:embed="rId10"/>
                           <a:stretch>
                             <a:fillRect/>
                           </a:stretch>
@@ -1552,7 +1887,9 @@
                             <a:off x="0" y="0"/>
                             <a:ext cx="4983480" cy="666814"/>
                           </a:xfrm>
-                          <a:prstGeom prst="rect"/>
+                          <a:prstGeom prst="rect">
+                            <a:avLst/>
+                          </a:prstGeom>
                         </pic:spPr>
                       </pic:pic>
                     </a:graphicData>
@@ -1572,10 +1909,6 @@
               <w:jc w:val="right"/>
             </w:pPr>
             <w:r>
-              <w:rPr>
-                <w:rFonts w:ascii="Times New Roman" w:hAnsi="Times New Roman"/>
-                <w:sz w:val="20"/>
-              </w:rPr>
               <w:t>(5)</w:t>
             </w:r>
           </w:p>
@@ -1584,12 +1917,60 @@
     </w:tbl>
     <w:p>
       <w:pPr>
-        <w:spacing w:after="40" w:before="40"/>
+        <w:spacing w:before="40" w:after="40"/>
       </w:pPr>
     </w:p>
     <w:p>
       <w:r>
-        <w:t>The linguistic feature vector u_text and the rating feature vector u_rating are merged via a concatenation layer into an 80-dimensional joint multimodal representation u_fused = [u_text || u_rating] in R^(80). This representation is processed through a regularized dense layer and a final sigmoid output unit:</w:t>
+        <w:t xml:space="preserve">The linguistic feature vector </w:t>
+      </w:r>
+      <w:proofErr w:type="spellStart"/>
+      <w:r>
+        <w:t>u_text</w:t>
+      </w:r>
+      <w:proofErr w:type="spellEnd"/>
+      <w:r>
+        <w:t xml:space="preserve"> and the rating feature vector </w:t>
+      </w:r>
+      <w:proofErr w:type="spellStart"/>
+      <w:r>
+        <w:t>u_rating</w:t>
+      </w:r>
+      <w:proofErr w:type="spellEnd"/>
+      <w:r>
+        <w:t xml:space="preserve"> are merged via a concatenation layer into an 80-dimensional joint multimodal representation </w:t>
+      </w:r>
+      <w:proofErr w:type="spellStart"/>
+      <w:r>
+        <w:t>u_fused</w:t>
+      </w:r>
+      <w:proofErr w:type="spellEnd"/>
+      <w:r>
+        <w:t xml:space="preserve"> = [</w:t>
+      </w:r>
+      <w:proofErr w:type="spellStart"/>
+      <w:r>
+        <w:t>u_text</w:t>
+      </w:r>
+      <w:proofErr w:type="spellEnd"/>
+      <w:r>
+        <w:t xml:space="preserve"> || </w:t>
+      </w:r>
+      <w:proofErr w:type="spellStart"/>
+      <w:r>
+        <w:t>u_rating</w:t>
+      </w:r>
+      <w:proofErr w:type="spellEnd"/>
+      <w:r>
+        <w:t>] in R</w:t>
+      </w:r>
+      <w:proofErr w:type="gramStart"/>
+      <w:r>
+        <w:t>^(</w:t>
+      </w:r>
+      <w:proofErr w:type="gramEnd"/>
+      <w:r>
+        <w:t>80). This representation is processed through a regularized dense layer and a final sigmoid output unit:</w:t>
       </w:r>
     </w:p>
     <w:tbl>
@@ -1617,22 +1998,26 @@
               <w:jc w:val="center"/>
             </w:pPr>
             <w:r>
+              <w:rPr>
+                <w:noProof/>
+              </w:rPr>
               <w:drawing>
-                <wp:inline xmlns:a="http://schemas.openxmlformats.org/drawingml/2006/main" xmlns:pic="http://schemas.openxmlformats.org/drawingml/2006/picture">
+                <wp:inline distT="0" distB="0" distL="0" distR="0" wp14:anchorId="14D6B78E" wp14:editId="0C4C86C6">
                   <wp:extent cx="4983480" cy="666814"/>
+                  <wp:effectExtent l="0" t="0" r="0" b="0"/>
                   <wp:docPr id="11" name="Picture 11"/>
                   <wp:cNvGraphicFramePr>
-                    <a:graphicFrameLocks noChangeAspect="1"/>
+                    <a:graphicFrameLocks xmlns:a="http://schemas.openxmlformats.org/drawingml/2006/main" noChangeAspect="1"/>
                   </wp:cNvGraphicFramePr>
-                  <a:graphic>
+                  <a:graphic xmlns:a="http://schemas.openxmlformats.org/drawingml/2006/main">
                     <a:graphicData uri="http://schemas.openxmlformats.org/drawingml/2006/picture">
-                      <pic:pic>
+                      <pic:pic xmlns:pic="http://schemas.openxmlformats.org/drawingml/2006/picture">
                         <pic:nvPicPr>
                           <pic:cNvPr id="0" name="eq_06.png"/>
                           <pic:cNvPicPr/>
                         </pic:nvPicPr>
                         <pic:blipFill>
-                          <a:blip r:embed="rId18"/>
+                          <a:blip r:embed="rId11"/>
                           <a:stretch>
                             <a:fillRect/>
                           </a:stretch>
@@ -1642,7 +2027,9 @@
                             <a:off x="0" y="0"/>
                             <a:ext cx="4983480" cy="666814"/>
                           </a:xfrm>
-                          <a:prstGeom prst="rect"/>
+                          <a:prstGeom prst="rect">
+                            <a:avLst/>
+                          </a:prstGeom>
                         </pic:spPr>
                       </pic:pic>
                     </a:graphicData>
@@ -1662,10 +2049,6 @@
               <w:jc w:val="right"/>
             </w:pPr>
             <w:r>
-              <w:rPr>
-                <w:rFonts w:ascii="Times New Roman" w:hAnsi="Times New Roman"/>
-                <w:sz w:val="20"/>
-              </w:rPr>
               <w:t>(6)</w:t>
             </w:r>
           </w:p>
@@ -1674,7 +2057,7 @@
     </w:tbl>
     <w:p>
       <w:pPr>
-        <w:spacing w:after="40" w:before="40"/>
+        <w:spacing w:before="40" w:after="40"/>
       </w:pPr>
     </w:p>
     <w:tbl>
@@ -1702,22 +2085,26 @@
               <w:jc w:val="center"/>
             </w:pPr>
             <w:r>
+              <w:rPr>
+                <w:noProof/>
+              </w:rPr>
               <w:drawing>
-                <wp:inline xmlns:a="http://schemas.openxmlformats.org/drawingml/2006/main" xmlns:pic="http://schemas.openxmlformats.org/drawingml/2006/picture">
+                <wp:inline distT="0" distB="0" distL="0" distR="0" wp14:anchorId="6EDB18A4" wp14:editId="664D4D0D">
                   <wp:extent cx="4983480" cy="666814"/>
+                  <wp:effectExtent l="0" t="0" r="0" b="0"/>
                   <wp:docPr id="12" name="Picture 12"/>
                   <wp:cNvGraphicFramePr>
-                    <a:graphicFrameLocks noChangeAspect="1"/>
+                    <a:graphicFrameLocks xmlns:a="http://schemas.openxmlformats.org/drawingml/2006/main" noChangeAspect="1"/>
                   </wp:cNvGraphicFramePr>
-                  <a:graphic>
+                  <a:graphic xmlns:a="http://schemas.openxmlformats.org/drawingml/2006/main">
                     <a:graphicData uri="http://schemas.openxmlformats.org/drawingml/2006/picture">
-                      <pic:pic>
+                      <pic:pic xmlns:pic="http://schemas.openxmlformats.org/drawingml/2006/picture">
                         <pic:nvPicPr>
                           <pic:cNvPr id="0" name="eq_07.png"/>
                           <pic:cNvPicPr/>
                         </pic:nvPicPr>
                         <pic:blipFill>
-                          <a:blip r:embed="rId19"/>
+                          <a:blip r:embed="rId12"/>
                           <a:stretch>
                             <a:fillRect/>
                           </a:stretch>
@@ -1727,7 +2114,9 @@
                             <a:off x="0" y="0"/>
                             <a:ext cx="4983480" cy="666814"/>
                           </a:xfrm>
-                          <a:prstGeom prst="rect"/>
+                          <a:prstGeom prst="rect">
+                            <a:avLst/>
+                          </a:prstGeom>
                         </pic:spPr>
                       </pic:pic>
                     </a:graphicData>
@@ -1747,10 +2136,6 @@
               <w:jc w:val="right"/>
             </w:pPr>
             <w:r>
-              <w:rPr>
-                <w:rFonts w:ascii="Times New Roman" w:hAnsi="Times New Roman"/>
-                <w:sz w:val="20"/>
-              </w:rPr>
               <w:t>(7)</w:t>
             </w:r>
           </w:p>
@@ -1759,12 +2144,20 @@
     </w:tbl>
     <w:p>
       <w:pPr>
-        <w:spacing w:after="40" w:before="40"/>
+        <w:spacing w:before="40" w:after="40"/>
       </w:pPr>
     </w:p>
     <w:p>
       <w:r>
-        <w:t>The network parameters theta are optimized end-to-end by minimizing the binary cross-entropy objective function:</w:t>
+        <w:t xml:space="preserve">The network parameters theta </w:t>
+      </w:r>
+      <w:proofErr w:type="gramStart"/>
+      <w:r>
+        <w:t>are</w:t>
+      </w:r>
+      <w:proofErr w:type="gramEnd"/>
+      <w:r>
+        <w:t xml:space="preserve"> optimized end-to-end by minimizing the binary cross-entropy objective function:</w:t>
       </w:r>
     </w:p>
     <w:tbl>
@@ -1792,22 +2185,26 @@
               <w:jc w:val="center"/>
             </w:pPr>
             <w:r>
+              <w:rPr>
+                <w:noProof/>
+              </w:rPr>
               <w:drawing>
-                <wp:inline xmlns:a="http://schemas.openxmlformats.org/drawingml/2006/main" xmlns:pic="http://schemas.openxmlformats.org/drawingml/2006/picture">
+                <wp:inline distT="0" distB="0" distL="0" distR="0" wp14:anchorId="3E91E721" wp14:editId="7E5CBD0B">
                   <wp:extent cx="4983480" cy="666814"/>
+                  <wp:effectExtent l="0" t="0" r="0" b="0"/>
                   <wp:docPr id="13" name="Picture 13"/>
                   <wp:cNvGraphicFramePr>
-                    <a:graphicFrameLocks noChangeAspect="1"/>
+                    <a:graphicFrameLocks xmlns:a="http://schemas.openxmlformats.org/drawingml/2006/main" noChangeAspect="1"/>
                   </wp:cNvGraphicFramePr>
-                  <a:graphic>
+                  <a:graphic xmlns:a="http://schemas.openxmlformats.org/drawingml/2006/main">
                     <a:graphicData uri="http://schemas.openxmlformats.org/drawingml/2006/picture">
-                      <pic:pic>
+                      <pic:pic xmlns:pic="http://schemas.openxmlformats.org/drawingml/2006/picture">
                         <pic:nvPicPr>
                           <pic:cNvPr id="0" name="eq_08.png"/>
                           <pic:cNvPicPr/>
                         </pic:nvPicPr>
                         <pic:blipFill>
-                          <a:blip r:embed="rId20"/>
+                          <a:blip r:embed="rId13"/>
                           <a:stretch>
                             <a:fillRect/>
                           </a:stretch>
@@ -1817,7 +2214,9 @@
                             <a:off x="0" y="0"/>
                             <a:ext cx="4983480" cy="666814"/>
                           </a:xfrm>
-                          <a:prstGeom prst="rect"/>
+                          <a:prstGeom prst="rect">
+                            <a:avLst/>
+                          </a:prstGeom>
                         </pic:spPr>
                       </pic:pic>
                     </a:graphicData>
@@ -1837,10 +2236,6 @@
               <w:jc w:val="right"/>
             </w:pPr>
             <w:r>
-              <w:rPr>
-                <w:rFonts w:ascii="Times New Roman" w:hAnsi="Times New Roman"/>
-                <w:sz w:val="20"/>
-              </w:rPr>
               <w:t>(8)</w:t>
             </w:r>
           </w:p>
@@ -1849,7 +2244,7 @@
     </w:tbl>
     <w:p>
       <w:pPr>
-        <w:spacing w:after="40" w:before="40"/>
+        <w:spacing w:before="40" w:after="40"/>
       </w:pPr>
     </w:p>
     <w:p>
@@ -1877,7 +2272,7 @@
                     <pic:cNvPicPr/>
                   </pic:nvPicPr>
                   <pic:blipFill>
-                    <a:blip r:embed="rId6"/>
+                    <a:blip r:embed="rId14"/>
                     <a:stretch>
                       <a:fillRect/>
                     </a:stretch>
@@ -2072,12 +2467,14 @@
               <w:spacing w:before="40" w:after="40" w:line="240" w:lineRule="auto"/>
               <w:jc w:val="left"/>
             </w:pPr>
+            <w:proofErr w:type="spellStart"/>
             <w:r>
               <w:rPr>
                 <w:sz w:val="17"/>
               </w:rPr>
               <w:t>text_input</w:t>
             </w:r>
+            <w:proofErr w:type="spellEnd"/>
           </w:p>
         </w:tc>
         <w:tc>
@@ -2089,12 +2486,14 @@
               <w:spacing w:before="40" w:after="40" w:line="240" w:lineRule="auto"/>
               <w:jc w:val="left"/>
             </w:pPr>
+            <w:proofErr w:type="spellStart"/>
             <w:r>
               <w:rPr>
                 <w:sz w:val="17"/>
               </w:rPr>
               <w:t>InputLayer</w:t>
             </w:r>
+            <w:proofErr w:type="spellEnd"/>
           </w:p>
         </w:tc>
         <w:tc>
@@ -2269,11 +2668,19 @@
               <w:spacing w:before="40" w:after="40" w:line="240" w:lineRule="auto"/>
               <w:jc w:val="left"/>
             </w:pPr>
-            <w:r>
-              <w:rPr>
-                <w:sz w:val="17"/>
-              </w:rPr>
-              <w:t>BiLSTM (64 units)</w:t>
+            <w:proofErr w:type="spellStart"/>
+            <w:r>
+              <w:rPr>
+                <w:sz w:val="17"/>
+              </w:rPr>
+              <w:t>BiLSTM</w:t>
+            </w:r>
+            <w:proofErr w:type="spellEnd"/>
+            <w:r>
+              <w:rPr>
+                <w:sz w:val="17"/>
+              </w:rPr>
+              <w:t xml:space="preserve"> (64 units)</w:t>
             </w:r>
           </w:p>
         </w:tc>
@@ -2342,12 +2749,14 @@
               <w:spacing w:before="40" w:after="40" w:line="240" w:lineRule="auto"/>
               <w:jc w:val="left"/>
             </w:pPr>
+            <w:proofErr w:type="spellStart"/>
             <w:r>
               <w:rPr>
                 <w:sz w:val="17"/>
               </w:rPr>
               <w:t>input_rating</w:t>
             </w:r>
+            <w:proofErr w:type="spellEnd"/>
           </w:p>
         </w:tc>
         <w:tc>
@@ -2359,12 +2768,14 @@
               <w:spacing w:before="40" w:after="40" w:line="240" w:lineRule="auto"/>
               <w:jc w:val="left"/>
             </w:pPr>
+            <w:proofErr w:type="spellStart"/>
             <w:r>
               <w:rPr>
                 <w:sz w:val="17"/>
               </w:rPr>
               <w:t>InputLayer</w:t>
             </w:r>
+            <w:proofErr w:type="spellEnd"/>
           </w:p>
         </w:tc>
         <w:tc>
@@ -2432,12 +2843,14 @@
               <w:spacing w:before="40" w:after="40" w:line="240" w:lineRule="auto"/>
               <w:jc w:val="left"/>
             </w:pPr>
+            <w:proofErr w:type="spellStart"/>
             <w:r>
               <w:rPr>
                 <w:sz w:val="17"/>
               </w:rPr>
               <w:t>dense_text</w:t>
             </w:r>
+            <w:proofErr w:type="spellEnd"/>
           </w:p>
         </w:tc>
         <w:tc>
@@ -2453,7 +2866,21 @@
               <w:rPr>
                 <w:sz w:val="17"/>
               </w:rPr>
-              <w:t>Dense (ReLU)</w:t>
+              <w:t>Dense (</w:t>
+            </w:r>
+            <w:proofErr w:type="spellStart"/>
+            <w:r>
+              <w:rPr>
+                <w:sz w:val="17"/>
+              </w:rPr>
+              <w:t>ReLU</w:t>
+            </w:r>
+            <w:proofErr w:type="spellEnd"/>
+            <w:r>
+              <w:rPr>
+                <w:sz w:val="17"/>
+              </w:rPr>
+              <w:t>)</w:t>
             </w:r>
           </w:p>
         </w:tc>
@@ -2522,12 +2949,14 @@
               <w:spacing w:before="40" w:after="40" w:line="240" w:lineRule="auto"/>
               <w:jc w:val="left"/>
             </w:pPr>
+            <w:proofErr w:type="spellStart"/>
             <w:r>
               <w:rPr>
                 <w:sz w:val="17"/>
               </w:rPr>
               <w:t>dense_rating</w:t>
             </w:r>
+            <w:proofErr w:type="spellEnd"/>
           </w:p>
         </w:tc>
         <w:tc>
@@ -2543,7 +2972,21 @@
               <w:rPr>
                 <w:sz w:val="17"/>
               </w:rPr>
-              <w:t>Dense (ReLU)</w:t>
+              <w:t>Dense (</w:t>
+            </w:r>
+            <w:proofErr w:type="spellStart"/>
+            <w:r>
+              <w:rPr>
+                <w:sz w:val="17"/>
+              </w:rPr>
+              <w:t>ReLU</w:t>
+            </w:r>
+            <w:proofErr w:type="spellEnd"/>
+            <w:r>
+              <w:rPr>
+                <w:sz w:val="17"/>
+              </w:rPr>
+              <w:t>)</w:t>
             </w:r>
           </w:p>
         </w:tc>
@@ -2702,12 +3145,14 @@
               <w:spacing w:before="40" w:after="40" w:line="240" w:lineRule="auto"/>
               <w:jc w:val="left"/>
             </w:pPr>
+            <w:proofErr w:type="spellStart"/>
             <w:r>
               <w:rPr>
                 <w:sz w:val="17"/>
               </w:rPr>
               <w:t>dense_fused</w:t>
             </w:r>
+            <w:proofErr w:type="spellEnd"/>
           </w:p>
         </w:tc>
         <w:tc>
@@ -2723,7 +3168,21 @@
               <w:rPr>
                 <w:sz w:val="17"/>
               </w:rPr>
-              <w:t>Dense (ReLU)</w:t>
+              <w:t>Dense (</w:t>
+            </w:r>
+            <w:proofErr w:type="spellStart"/>
+            <w:r>
+              <w:rPr>
+                <w:sz w:val="17"/>
+              </w:rPr>
+              <w:t>ReLU</w:t>
+            </w:r>
+            <w:proofErr w:type="spellEnd"/>
+            <w:r>
+              <w:rPr>
+                <w:sz w:val="17"/>
+              </w:rPr>
+              <w:t>)</w:t>
             </w:r>
           </w:p>
         </w:tc>
@@ -2882,12 +3341,14 @@
               <w:spacing w:before="40" w:after="40" w:line="240" w:lineRule="auto"/>
               <w:jc w:val="left"/>
             </w:pPr>
+            <w:proofErr w:type="spellStart"/>
             <w:r>
               <w:rPr>
                 <w:sz w:val="17"/>
               </w:rPr>
               <w:t>dense_output</w:t>
             </w:r>
+            <w:proofErr w:type="spellEnd"/>
           </w:p>
         </w:tc>
         <w:tc>
@@ -2962,7 +3423,7 @@
     </w:tbl>
     <w:p>
       <w:pPr>
-        <w:spacing w:after="40" w:before="40"/>
+        <w:spacing w:before="40" w:after="40"/>
       </w:pPr>
     </w:p>
     <w:p>
@@ -2975,12 +3436,45 @@
           <w:b/>
           <w:sz w:val="22"/>
         </w:rPr>
-        <w:t>3.3 Subsystem 2: Sequential BiLSTM Metadata Classifier</w:t>
+        <w:lastRenderedPageBreak/>
+        <w:t xml:space="preserve">3.3 Subsystem 2: Sequential </w:t>
+      </w:r>
+      <w:proofErr w:type="spellStart"/>
+      <w:r>
+        <w:rPr>
+          <w:b/>
+          <w:sz w:val="22"/>
+        </w:rPr>
+        <w:t>BiLSTM</w:t>
+      </w:r>
+      <w:proofErr w:type="spellEnd"/>
+      <w:r>
+        <w:rPr>
+          <w:b/>
+          <w:sz w:val="22"/>
+        </w:rPr>
+        <w:t xml:space="preserve"> Metadata Classifier</w:t>
       </w:r>
     </w:p>
     <w:p>
       <w:r>
-        <w:t>The Metadata Authenticity Classifier inspects commercial listing titles and descriptive copy to identify unauthorized replicas and deceptive seller phrasing. The input token sequence m = [m_1, m_2, ..., m_M] (M=110) is projected into a 128-dimensional embedding space, followed by a BiLSTM with 128 hidden units per direction, outputting a 256-dimensional hidden vector:</w:t>
+        <w:t xml:space="preserve">The Metadata Authenticity Classifier inspects commercial listing titles and descriptive copy to identify unauthorized replicas and deceptive seller phrasing. The input token sequence m = [m_1, m_2, ..., </w:t>
+      </w:r>
+      <w:proofErr w:type="spellStart"/>
+      <w:r>
+        <w:t>m_M</w:t>
+      </w:r>
+      <w:proofErr w:type="spellEnd"/>
+      <w:r>
+        <w:t xml:space="preserve">] (M=110) is projected into a 128-dimensional embedding space, followed by a </w:t>
+      </w:r>
+      <w:proofErr w:type="spellStart"/>
+      <w:r>
+        <w:t>BiLSTM</w:t>
+      </w:r>
+      <w:proofErr w:type="spellEnd"/>
+      <w:r>
+        <w:t xml:space="preserve"> with 128 hidden units per direction, outputting a 256-dimensional hidden vector:</w:t>
       </w:r>
     </w:p>
     <w:tbl>
@@ -3008,22 +3502,26 @@
               <w:jc w:val="center"/>
             </w:pPr>
             <w:r>
+              <w:rPr>
+                <w:noProof/>
+              </w:rPr>
               <w:drawing>
-                <wp:inline xmlns:a="http://schemas.openxmlformats.org/drawingml/2006/main" xmlns:pic="http://schemas.openxmlformats.org/drawingml/2006/picture">
+                <wp:inline distT="0" distB="0" distL="0" distR="0" wp14:anchorId="46CD49F4" wp14:editId="4C9AF254">
                   <wp:extent cx="4983480" cy="666814"/>
+                  <wp:effectExtent l="0" t="0" r="0" b="0"/>
                   <wp:docPr id="14" name="Picture 14"/>
                   <wp:cNvGraphicFramePr>
-                    <a:graphicFrameLocks noChangeAspect="1"/>
+                    <a:graphicFrameLocks xmlns:a="http://schemas.openxmlformats.org/drawingml/2006/main" noChangeAspect="1"/>
                   </wp:cNvGraphicFramePr>
-                  <a:graphic>
+                  <a:graphic xmlns:a="http://schemas.openxmlformats.org/drawingml/2006/main">
                     <a:graphicData uri="http://schemas.openxmlformats.org/drawingml/2006/picture">
-                      <pic:pic>
+                      <pic:pic xmlns:pic="http://schemas.openxmlformats.org/drawingml/2006/picture">
                         <pic:nvPicPr>
                           <pic:cNvPr id="0" name="eq_09.png"/>
                           <pic:cNvPicPr/>
                         </pic:nvPicPr>
                         <pic:blipFill>
-                          <a:blip r:embed="rId21"/>
+                          <a:blip r:embed="rId15"/>
                           <a:stretch>
                             <a:fillRect/>
                           </a:stretch>
@@ -3033,7 +3531,9 @@
                             <a:off x="0" y="0"/>
                             <a:ext cx="4983480" cy="666814"/>
                           </a:xfrm>
-                          <a:prstGeom prst="rect"/>
+                          <a:prstGeom prst="rect">
+                            <a:avLst/>
+                          </a:prstGeom>
                         </pic:spPr>
                       </pic:pic>
                     </a:graphicData>
@@ -3053,10 +3553,6 @@
               <w:jc w:val="right"/>
             </w:pPr>
             <w:r>
-              <w:rPr>
-                <w:rFonts w:ascii="Times New Roman" w:hAnsi="Times New Roman"/>
-                <w:sz w:val="20"/>
-              </w:rPr>
               <w:t>(9)</w:t>
             </w:r>
           </w:p>
@@ -3065,7 +3561,7 @@
     </w:tbl>
     <w:p>
       <w:pPr>
-        <w:spacing w:after="40" w:before="40"/>
+        <w:spacing w:before="40" w:after="40"/>
       </w:pPr>
     </w:p>
     <w:p>
@@ -3098,22 +3594,26 @@
               <w:jc w:val="center"/>
             </w:pPr>
             <w:r>
+              <w:rPr>
+                <w:noProof/>
+              </w:rPr>
               <w:drawing>
-                <wp:inline xmlns:a="http://schemas.openxmlformats.org/drawingml/2006/main" xmlns:pic="http://schemas.openxmlformats.org/drawingml/2006/picture">
+                <wp:inline distT="0" distB="0" distL="0" distR="0" wp14:anchorId="6F4F4E70" wp14:editId="50811B4B">
                   <wp:extent cx="4983480" cy="666814"/>
+                  <wp:effectExtent l="0" t="0" r="0" b="0"/>
                   <wp:docPr id="15" name="Picture 15"/>
                   <wp:cNvGraphicFramePr>
-                    <a:graphicFrameLocks noChangeAspect="1"/>
+                    <a:graphicFrameLocks xmlns:a="http://schemas.openxmlformats.org/drawingml/2006/main" noChangeAspect="1"/>
                   </wp:cNvGraphicFramePr>
-                  <a:graphic>
+                  <a:graphic xmlns:a="http://schemas.openxmlformats.org/drawingml/2006/main">
                     <a:graphicData uri="http://schemas.openxmlformats.org/drawingml/2006/picture">
-                      <pic:pic>
+                      <pic:pic xmlns:pic="http://schemas.openxmlformats.org/drawingml/2006/picture">
                         <pic:nvPicPr>
                           <pic:cNvPr id="0" name="eq_10.png"/>
                           <pic:cNvPicPr/>
                         </pic:nvPicPr>
                         <pic:blipFill>
-                          <a:blip r:embed="rId22"/>
+                          <a:blip r:embed="rId16"/>
                           <a:stretch>
                             <a:fillRect/>
                           </a:stretch>
@@ -3123,7 +3623,9 @@
                             <a:off x="0" y="0"/>
                             <a:ext cx="4983480" cy="666814"/>
                           </a:xfrm>
-                          <a:prstGeom prst="rect"/>
+                          <a:prstGeom prst="rect">
+                            <a:avLst/>
+                          </a:prstGeom>
                         </pic:spPr>
                       </pic:pic>
                     </a:graphicData>
@@ -3143,10 +3645,6 @@
               <w:jc w:val="right"/>
             </w:pPr>
             <w:r>
-              <w:rPr>
-                <w:rFonts w:ascii="Times New Roman" w:hAnsi="Times New Roman"/>
-                <w:sz w:val="20"/>
-              </w:rPr>
               <w:t>(10)</w:t>
             </w:r>
           </w:p>
@@ -3155,7 +3653,7 @@
     </w:tbl>
     <w:p>
       <w:pPr>
-        <w:spacing w:after="40" w:before="40"/>
+        <w:spacing w:before="40" w:after="40"/>
       </w:pPr>
     </w:p>
     <w:tbl>
@@ -3183,22 +3681,26 @@
               <w:jc w:val="center"/>
             </w:pPr>
             <w:r>
+              <w:rPr>
+                <w:noProof/>
+              </w:rPr>
               <w:drawing>
-                <wp:inline xmlns:a="http://schemas.openxmlformats.org/drawingml/2006/main" xmlns:pic="http://schemas.openxmlformats.org/drawingml/2006/picture">
+                <wp:inline distT="0" distB="0" distL="0" distR="0" wp14:anchorId="0400E8C9" wp14:editId="31EF2702">
                   <wp:extent cx="4983480" cy="666814"/>
+                  <wp:effectExtent l="0" t="0" r="0" b="0"/>
                   <wp:docPr id="16" name="Picture 16"/>
                   <wp:cNvGraphicFramePr>
-                    <a:graphicFrameLocks noChangeAspect="1"/>
+                    <a:graphicFrameLocks xmlns:a="http://schemas.openxmlformats.org/drawingml/2006/main" noChangeAspect="1"/>
                   </wp:cNvGraphicFramePr>
-                  <a:graphic>
+                  <a:graphic xmlns:a="http://schemas.openxmlformats.org/drawingml/2006/main">
                     <a:graphicData uri="http://schemas.openxmlformats.org/drawingml/2006/picture">
-                      <pic:pic>
+                      <pic:pic xmlns:pic="http://schemas.openxmlformats.org/drawingml/2006/picture">
                         <pic:nvPicPr>
                           <pic:cNvPr id="0" name="eq_11.png"/>
                           <pic:cNvPicPr/>
                         </pic:nvPicPr>
                         <pic:blipFill>
-                          <a:blip r:embed="rId23"/>
+                          <a:blip r:embed="rId17"/>
                           <a:stretch>
                             <a:fillRect/>
                           </a:stretch>
@@ -3208,7 +3710,9 @@
                             <a:off x="0" y="0"/>
                             <a:ext cx="4983480" cy="666814"/>
                           </a:xfrm>
-                          <a:prstGeom prst="rect"/>
+                          <a:prstGeom prst="rect">
+                            <a:avLst/>
+                          </a:prstGeom>
                         </pic:spPr>
                       </pic:pic>
                     </a:graphicData>
@@ -3228,10 +3732,6 @@
               <w:jc w:val="right"/>
             </w:pPr>
             <w:r>
-              <w:rPr>
-                <w:rFonts w:ascii="Times New Roman" w:hAnsi="Times New Roman"/>
-                <w:sz w:val="20"/>
-              </w:rPr>
               <w:t>(11)</w:t>
             </w:r>
           </w:p>
@@ -3240,7 +3740,7 @@
     </w:tbl>
     <w:p>
       <w:pPr>
-        <w:spacing w:after="40" w:before="40"/>
+        <w:spacing w:before="40" w:after="40"/>
       </w:pPr>
     </w:p>
     <w:tbl>
@@ -3268,22 +3768,26 @@
               <w:jc w:val="center"/>
             </w:pPr>
             <w:r>
+              <w:rPr>
+                <w:noProof/>
+              </w:rPr>
               <w:drawing>
-                <wp:inline xmlns:a="http://schemas.openxmlformats.org/drawingml/2006/main" xmlns:pic="http://schemas.openxmlformats.org/drawingml/2006/picture">
+                <wp:inline distT="0" distB="0" distL="0" distR="0" wp14:anchorId="3EB85636" wp14:editId="40D03154">
                   <wp:extent cx="4983480" cy="666814"/>
+                  <wp:effectExtent l="0" t="0" r="0" b="0"/>
                   <wp:docPr id="17" name="Picture 17"/>
                   <wp:cNvGraphicFramePr>
-                    <a:graphicFrameLocks noChangeAspect="1"/>
+                    <a:graphicFrameLocks xmlns:a="http://schemas.openxmlformats.org/drawingml/2006/main" noChangeAspect="1"/>
                   </wp:cNvGraphicFramePr>
-                  <a:graphic>
+                  <a:graphic xmlns:a="http://schemas.openxmlformats.org/drawingml/2006/main">
                     <a:graphicData uri="http://schemas.openxmlformats.org/drawingml/2006/picture">
-                      <pic:pic>
+                      <pic:pic xmlns:pic="http://schemas.openxmlformats.org/drawingml/2006/picture">
                         <pic:nvPicPr>
                           <pic:cNvPr id="0" name="eq_12.png"/>
                           <pic:cNvPicPr/>
                         </pic:nvPicPr>
                         <pic:blipFill>
-                          <a:blip r:embed="rId24"/>
+                          <a:blip r:embed="rId18"/>
                           <a:stretch>
                             <a:fillRect/>
                           </a:stretch>
@@ -3293,7 +3797,9 @@
                             <a:off x="0" y="0"/>
                             <a:ext cx="4983480" cy="666814"/>
                           </a:xfrm>
-                          <a:prstGeom prst="rect"/>
+                          <a:prstGeom prst="rect">
+                            <a:avLst/>
+                          </a:prstGeom>
                         </pic:spPr>
                       </pic:pic>
                     </a:graphicData>
@@ -3313,10 +3819,6 @@
               <w:jc w:val="right"/>
             </w:pPr>
             <w:r>
-              <w:rPr>
-                <w:rFonts w:ascii="Times New Roman" w:hAnsi="Times New Roman"/>
-                <w:sz w:val="20"/>
-              </w:rPr>
               <w:t>(12)</w:t>
             </w:r>
           </w:p>
@@ -3325,12 +3827,20 @@
     </w:tbl>
     <w:p>
       <w:pPr>
-        <w:spacing w:after="40" w:before="40"/>
+        <w:spacing w:before="40" w:after="40"/>
       </w:pPr>
     </w:p>
     <w:p>
       <w:r>
-        <w:t>The final Metadata Authenticity Score S_meta in [0, 1] is defined as the mathematical complement of the counterfeit probability:</w:t>
+        <w:t xml:space="preserve">The final Metadata Authenticity Score </w:t>
+      </w:r>
+      <w:proofErr w:type="spellStart"/>
+      <w:r>
+        <w:t>S_meta</w:t>
+      </w:r>
+      <w:proofErr w:type="spellEnd"/>
+      <w:r>
+        <w:t xml:space="preserve"> in [0, 1] is defined as the mathematical complement of the counterfeit probability:</w:t>
       </w:r>
     </w:p>
     <w:tbl>
@@ -3358,22 +3868,26 @@
               <w:jc w:val="center"/>
             </w:pPr>
             <w:r>
+              <w:rPr>
+                <w:noProof/>
+              </w:rPr>
               <w:drawing>
-                <wp:inline xmlns:a="http://schemas.openxmlformats.org/drawingml/2006/main" xmlns:pic="http://schemas.openxmlformats.org/drawingml/2006/picture">
+                <wp:inline distT="0" distB="0" distL="0" distR="0" wp14:anchorId="0E0149F2" wp14:editId="627E8800">
                   <wp:extent cx="4983480" cy="666814"/>
+                  <wp:effectExtent l="0" t="0" r="0" b="0"/>
                   <wp:docPr id="18" name="Picture 18"/>
                   <wp:cNvGraphicFramePr>
-                    <a:graphicFrameLocks noChangeAspect="1"/>
+                    <a:graphicFrameLocks xmlns:a="http://schemas.openxmlformats.org/drawingml/2006/main" noChangeAspect="1"/>
                   </wp:cNvGraphicFramePr>
-                  <a:graphic>
+                  <a:graphic xmlns:a="http://schemas.openxmlformats.org/drawingml/2006/main">
                     <a:graphicData uri="http://schemas.openxmlformats.org/drawingml/2006/picture">
-                      <pic:pic>
+                      <pic:pic xmlns:pic="http://schemas.openxmlformats.org/drawingml/2006/picture">
                         <pic:nvPicPr>
                           <pic:cNvPr id="0" name="eq_13.png"/>
                           <pic:cNvPicPr/>
                         </pic:nvPicPr>
                         <pic:blipFill>
-                          <a:blip r:embed="rId25"/>
+                          <a:blip r:embed="rId19"/>
                           <a:stretch>
                             <a:fillRect/>
                           </a:stretch>
@@ -3383,7 +3897,9 @@
                             <a:off x="0" y="0"/>
                             <a:ext cx="4983480" cy="666814"/>
                           </a:xfrm>
-                          <a:prstGeom prst="rect"/>
+                          <a:prstGeom prst="rect">
+                            <a:avLst/>
+                          </a:prstGeom>
                         </pic:spPr>
                       </pic:pic>
                     </a:graphicData>
@@ -3403,10 +3919,6 @@
               <w:jc w:val="right"/>
             </w:pPr>
             <w:r>
-              <w:rPr>
-                <w:rFonts w:ascii="Times New Roman" w:hAnsi="Times New Roman"/>
-                <w:sz w:val="20"/>
-              </w:rPr>
               <w:t>(13)</w:t>
             </w:r>
           </w:p>
@@ -3415,7 +3927,7 @@
     </w:tbl>
     <w:p>
       <w:pPr>
-        <w:spacing w:after="40" w:before="40"/>
+        <w:spacing w:before="40" w:after="40"/>
       </w:pPr>
     </w:p>
     <w:p>
@@ -3427,7 +3939,6 @@
         <w:rPr>
           <w:noProof/>
         </w:rPr>
-        <w:lastRenderedPageBreak/>
         <w:drawing>
           <wp:inline distT="0" distB="0" distL="0" distR="0" wp14:anchorId="293C47A9" wp14:editId="040D191D">
             <wp:extent cx="5825557" cy="1428750"/>
@@ -3444,7 +3955,7 @@
                     <pic:cNvPicPr/>
                   </pic:nvPicPr>
                   <pic:blipFill>
-                    <a:blip r:embed="rId7"/>
+                    <a:blip r:embed="rId20"/>
                     <a:stretch>
                       <a:fillRect/>
                     </a:stretch>
@@ -3476,6 +3987,7 @@
           <w:i/>
           <w:sz w:val="19"/>
         </w:rPr>
+        <w:lastRenderedPageBreak/>
         <w:t>Fig. 2 Block diagram of the TrustNet Metadata Classifier Architecture</w:t>
       </w:r>
     </w:p>
@@ -3489,7 +4001,23 @@
           <w:b/>
           <w:sz w:val="19"/>
         </w:rPr>
-        <w:t>Table 3 Layer description of the Sequential BiLSTM Metadata Classifier</w:t>
+        <w:t xml:space="preserve">Table 3 Layer description of the Sequential </w:t>
+      </w:r>
+      <w:proofErr w:type="spellStart"/>
+      <w:r>
+        <w:rPr>
+          <w:b/>
+          <w:sz w:val="19"/>
+        </w:rPr>
+        <w:t>BiLSTM</w:t>
+      </w:r>
+      <w:proofErr w:type="spellEnd"/>
+      <w:r>
+        <w:rPr>
+          <w:b/>
+          <w:sz w:val="19"/>
+        </w:rPr>
+        <w:t xml:space="preserve"> Metadata Classifier</w:t>
       </w:r>
     </w:p>
     <w:tbl>
@@ -3639,12 +4167,14 @@
               <w:spacing w:before="40" w:after="40" w:line="240" w:lineRule="auto"/>
               <w:jc w:val="left"/>
             </w:pPr>
+            <w:proofErr w:type="spellStart"/>
             <w:r>
               <w:rPr>
                 <w:sz w:val="17"/>
               </w:rPr>
               <w:t>input_metadata</w:t>
             </w:r>
+            <w:proofErr w:type="spellEnd"/>
           </w:p>
         </w:tc>
         <w:tc>
@@ -3656,12 +4186,14 @@
               <w:spacing w:before="40" w:after="40" w:line="240" w:lineRule="auto"/>
               <w:jc w:val="left"/>
             </w:pPr>
+            <w:proofErr w:type="spellStart"/>
             <w:r>
               <w:rPr>
                 <w:sz w:val="17"/>
               </w:rPr>
               <w:t>InputLayer</w:t>
             </w:r>
+            <w:proofErr w:type="spellEnd"/>
           </w:p>
         </w:tc>
         <w:tc>
@@ -3729,12 +4261,14 @@
               <w:spacing w:before="40" w:after="40" w:line="240" w:lineRule="auto"/>
               <w:jc w:val="left"/>
             </w:pPr>
+            <w:proofErr w:type="spellStart"/>
             <w:r>
               <w:rPr>
                 <w:sz w:val="17"/>
               </w:rPr>
               <w:t>embedding_meta</w:t>
             </w:r>
+            <w:proofErr w:type="spellEnd"/>
           </w:p>
         </w:tc>
         <w:tc>
@@ -3819,12 +4353,14 @@
               <w:spacing w:before="40" w:after="40" w:line="240" w:lineRule="auto"/>
               <w:jc w:val="left"/>
             </w:pPr>
+            <w:proofErr w:type="spellStart"/>
             <w:r>
               <w:rPr>
                 <w:sz w:val="17"/>
               </w:rPr>
               <w:t>bidirectional_meta</w:t>
             </w:r>
+            <w:proofErr w:type="spellEnd"/>
           </w:p>
         </w:tc>
         <w:tc>
@@ -3836,11 +4372,19 @@
               <w:spacing w:before="40" w:after="40" w:line="240" w:lineRule="auto"/>
               <w:jc w:val="left"/>
             </w:pPr>
-            <w:r>
-              <w:rPr>
-                <w:sz w:val="17"/>
-              </w:rPr>
-              <w:t>BiLSTM (128 units)</w:t>
+            <w:proofErr w:type="spellStart"/>
+            <w:r>
+              <w:rPr>
+                <w:sz w:val="17"/>
+              </w:rPr>
+              <w:t>BiLSTM</w:t>
+            </w:r>
+            <w:proofErr w:type="spellEnd"/>
+            <w:r>
+              <w:rPr>
+                <w:sz w:val="17"/>
+              </w:rPr>
+              <w:t xml:space="preserve"> (128 units)</w:t>
             </w:r>
           </w:p>
         </w:tc>
@@ -4020,7 +4564,21 @@
               <w:rPr>
                 <w:sz w:val="17"/>
               </w:rPr>
-              <w:t>Dense (ReLU)</w:t>
+              <w:t>Dense (</w:t>
+            </w:r>
+            <w:proofErr w:type="spellStart"/>
+            <w:r>
+              <w:rPr>
+                <w:sz w:val="17"/>
+              </w:rPr>
+              <w:t>ReLU</w:t>
+            </w:r>
+            <w:proofErr w:type="spellEnd"/>
+            <w:r>
+              <w:rPr>
+                <w:sz w:val="17"/>
+              </w:rPr>
+              <w:t>)</w:t>
             </w:r>
           </w:p>
         </w:tc>
@@ -4179,12 +4737,14 @@
               <w:spacing w:before="40" w:after="40" w:line="240" w:lineRule="auto"/>
               <w:jc w:val="left"/>
             </w:pPr>
+            <w:proofErr w:type="spellStart"/>
             <w:r>
               <w:rPr>
                 <w:sz w:val="17"/>
               </w:rPr>
               <w:t>dense_meta_out</w:t>
             </w:r>
+            <w:proofErr w:type="spellEnd"/>
           </w:p>
         </w:tc>
         <w:tc>
@@ -4259,7 +4819,7 @@
     </w:tbl>
     <w:p>
       <w:pPr>
-        <w:spacing w:after="40" w:before="40"/>
+        <w:spacing w:before="40" w:after="40"/>
       </w:pPr>
     </w:p>
     <w:p>
@@ -4305,22 +4865,26 @@
               <w:jc w:val="center"/>
             </w:pPr>
             <w:r>
+              <w:rPr>
+                <w:noProof/>
+              </w:rPr>
               <w:drawing>
-                <wp:inline xmlns:a="http://schemas.openxmlformats.org/drawingml/2006/main" xmlns:pic="http://schemas.openxmlformats.org/drawingml/2006/picture">
+                <wp:inline distT="0" distB="0" distL="0" distR="0" wp14:anchorId="2B3465F5" wp14:editId="14382872">
                   <wp:extent cx="4983480" cy="666814"/>
+                  <wp:effectExtent l="0" t="0" r="0" b="0"/>
                   <wp:docPr id="19" name="Picture 19"/>
                   <wp:cNvGraphicFramePr>
-                    <a:graphicFrameLocks noChangeAspect="1"/>
+                    <a:graphicFrameLocks xmlns:a="http://schemas.openxmlformats.org/drawingml/2006/main" noChangeAspect="1"/>
                   </wp:cNvGraphicFramePr>
-                  <a:graphic>
+                  <a:graphic xmlns:a="http://schemas.openxmlformats.org/drawingml/2006/main">
                     <a:graphicData uri="http://schemas.openxmlformats.org/drawingml/2006/picture">
-                      <pic:pic>
+                      <pic:pic xmlns:pic="http://schemas.openxmlformats.org/drawingml/2006/picture">
                         <pic:nvPicPr>
                           <pic:cNvPr id="0" name="eq_14.png"/>
                           <pic:cNvPicPr/>
                         </pic:nvPicPr>
                         <pic:blipFill>
-                          <a:blip r:embed="rId26"/>
+                          <a:blip r:embed="rId21"/>
                           <a:stretch>
                             <a:fillRect/>
                           </a:stretch>
@@ -4330,7 +4894,9 @@
                             <a:off x="0" y="0"/>
                             <a:ext cx="4983480" cy="666814"/>
                           </a:xfrm>
-                          <a:prstGeom prst="rect"/>
+                          <a:prstGeom prst="rect">
+                            <a:avLst/>
+                          </a:prstGeom>
                         </pic:spPr>
                       </pic:pic>
                     </a:graphicData>
@@ -4350,10 +4916,6 @@
               <w:jc w:val="right"/>
             </w:pPr>
             <w:r>
-              <w:rPr>
-                <w:rFonts w:ascii="Times New Roman" w:hAnsi="Times New Roman"/>
-                <w:sz w:val="20"/>
-              </w:rPr>
               <w:t>(14)</w:t>
             </w:r>
           </w:p>
@@ -4362,12 +4924,20 @@
     </w:tbl>
     <w:p>
       <w:pPr>
-        <w:spacing w:after="40" w:before="40"/>
+        <w:spacing w:before="40" w:after="40"/>
       </w:pPr>
     </w:p>
     <w:p>
       <w:r>
-        <w:t>Spatial dimensions are pooled via Global Average Pooling to produce a 2048-dimensional vector g in R^(2048). A penultimate dense layer projects this vector into a 256-dimensional brand feature representation:</w:t>
+        <w:t>Spatial dimensions are pooled via Global Average Pooling to produce a 2048-dimensional vector g in R</w:t>
+      </w:r>
+      <w:proofErr w:type="gramStart"/>
+      <w:r>
+        <w:t>^(</w:t>
+      </w:r>
+      <w:proofErr w:type="gramEnd"/>
+      <w:r>
+        <w:t>2048). A penultimate dense layer projects this vector into a 256-dimensional brand feature representation:</w:t>
       </w:r>
     </w:p>
     <w:tbl>
@@ -4395,22 +4965,26 @@
               <w:jc w:val="center"/>
             </w:pPr>
             <w:r>
+              <w:rPr>
+                <w:noProof/>
+              </w:rPr>
               <w:drawing>
-                <wp:inline xmlns:a="http://schemas.openxmlformats.org/drawingml/2006/main" xmlns:pic="http://schemas.openxmlformats.org/drawingml/2006/picture">
+                <wp:inline distT="0" distB="0" distL="0" distR="0" wp14:anchorId="497458FB" wp14:editId="0F867E89">
                   <wp:extent cx="4983480" cy="666814"/>
+                  <wp:effectExtent l="0" t="0" r="0" b="0"/>
                   <wp:docPr id="20" name="Picture 20"/>
                   <wp:cNvGraphicFramePr>
-                    <a:graphicFrameLocks noChangeAspect="1"/>
+                    <a:graphicFrameLocks xmlns:a="http://schemas.openxmlformats.org/drawingml/2006/main" noChangeAspect="1"/>
                   </wp:cNvGraphicFramePr>
-                  <a:graphic>
+                  <a:graphic xmlns:a="http://schemas.openxmlformats.org/drawingml/2006/main">
                     <a:graphicData uri="http://schemas.openxmlformats.org/drawingml/2006/picture">
-                      <pic:pic>
+                      <pic:pic xmlns:pic="http://schemas.openxmlformats.org/drawingml/2006/picture">
                         <pic:nvPicPr>
                           <pic:cNvPr id="0" name="eq_15.png"/>
                           <pic:cNvPicPr/>
                         </pic:nvPicPr>
                         <pic:blipFill>
-                          <a:blip r:embed="rId27"/>
+                          <a:blip r:embed="rId22"/>
                           <a:stretch>
                             <a:fillRect/>
                           </a:stretch>
@@ -4420,7 +4994,9 @@
                             <a:off x="0" y="0"/>
                             <a:ext cx="4983480" cy="666814"/>
                           </a:xfrm>
-                          <a:prstGeom prst="rect"/>
+                          <a:prstGeom prst="rect">
+                            <a:avLst/>
+                          </a:prstGeom>
                         </pic:spPr>
                       </pic:pic>
                     </a:graphicData>
@@ -4440,10 +5016,6 @@
               <w:jc w:val="right"/>
             </w:pPr>
             <w:r>
-              <w:rPr>
-                <w:rFonts w:ascii="Times New Roman" w:hAnsi="Times New Roman"/>
-                <w:sz w:val="20"/>
-              </w:rPr>
               <w:t>(15)</w:t>
             </w:r>
           </w:p>
@@ -4452,12 +5024,20 @@
     </w:tbl>
     <w:p>
       <w:pPr>
-        <w:spacing w:after="40" w:before="40"/>
+        <w:spacing w:before="40" w:after="40"/>
       </w:pPr>
     </w:p>
     <w:p>
       <w:r>
-        <w:t>For supervised pre-training across the 6 footwear brands, a dropout layer (p=0.4) and a 6-unit softmax classification head were attached, optimized via sparse categorical cross-entropy with balanced class weighting:</w:t>
+        <w:t xml:space="preserve">For supervised pre-training across the 6 footwear brands, a dropout layer (p=0.4) and a 6-unit </w:t>
+      </w:r>
+      <w:proofErr w:type="spellStart"/>
+      <w:r>
+        <w:t>softmax</w:t>
+      </w:r>
+      <w:proofErr w:type="spellEnd"/>
+      <w:r>
+        <w:t xml:space="preserve"> classification head were attached, optimized via sparse categorical cross-entropy with balanced class weighting:</w:t>
       </w:r>
     </w:p>
     <w:tbl>
@@ -4485,22 +5065,26 @@
               <w:jc w:val="center"/>
             </w:pPr>
             <w:r>
+              <w:rPr>
+                <w:noProof/>
+              </w:rPr>
               <w:drawing>
-                <wp:inline xmlns:a="http://schemas.openxmlformats.org/drawingml/2006/main" xmlns:pic="http://schemas.openxmlformats.org/drawingml/2006/picture">
+                <wp:inline distT="0" distB="0" distL="0" distR="0" wp14:anchorId="35B11015" wp14:editId="64C2C5F3">
                   <wp:extent cx="4983480" cy="666814"/>
+                  <wp:effectExtent l="0" t="0" r="0" b="0"/>
                   <wp:docPr id="21" name="Picture 21"/>
                   <wp:cNvGraphicFramePr>
-                    <a:graphicFrameLocks noChangeAspect="1"/>
+                    <a:graphicFrameLocks xmlns:a="http://schemas.openxmlformats.org/drawingml/2006/main" noChangeAspect="1"/>
                   </wp:cNvGraphicFramePr>
-                  <a:graphic>
+                  <a:graphic xmlns:a="http://schemas.openxmlformats.org/drawingml/2006/main">
                     <a:graphicData uri="http://schemas.openxmlformats.org/drawingml/2006/picture">
-                      <pic:pic>
+                      <pic:pic xmlns:pic="http://schemas.openxmlformats.org/drawingml/2006/picture">
                         <pic:nvPicPr>
                           <pic:cNvPr id="0" name="eq_16.png"/>
                           <pic:cNvPicPr/>
                         </pic:nvPicPr>
                         <pic:blipFill>
-                          <a:blip r:embed="rId28"/>
+                          <a:blip r:embed="rId23"/>
                           <a:stretch>
                             <a:fillRect/>
                           </a:stretch>
@@ -4510,7 +5094,9 @@
                             <a:off x="0" y="0"/>
                             <a:ext cx="4983480" cy="666814"/>
                           </a:xfrm>
-                          <a:prstGeom prst="rect"/>
+                          <a:prstGeom prst="rect">
+                            <a:avLst/>
+                          </a:prstGeom>
                         </pic:spPr>
                       </pic:pic>
                     </a:graphicData>
@@ -4530,10 +5116,6 @@
               <w:jc w:val="right"/>
             </w:pPr>
             <w:r>
-              <w:rPr>
-                <w:rFonts w:ascii="Times New Roman" w:hAnsi="Times New Roman"/>
-                <w:sz w:val="20"/>
-              </w:rPr>
               <w:t>(16)</w:t>
             </w:r>
           </w:p>
@@ -4542,12 +5124,28 @@
     </w:tbl>
     <w:p>
       <w:pPr>
-        <w:spacing w:after="40" w:before="40"/>
+        <w:spacing w:before="40" w:after="40"/>
       </w:pPr>
     </w:p>
     <w:p>
       <w:r>
-        <w:t>Following training, the softmax head is detached. The 256-dimensional penultimate representation e_dense is extracted and normalized to unit length:</w:t>
+        <w:t xml:space="preserve">Following training, the </w:t>
+      </w:r>
+      <w:proofErr w:type="spellStart"/>
+      <w:r>
+        <w:t>softmax</w:t>
+      </w:r>
+      <w:proofErr w:type="spellEnd"/>
+      <w:r>
+        <w:t xml:space="preserve"> head is detached. The 256-dimensional penultimate representation </w:t>
+      </w:r>
+      <w:proofErr w:type="spellStart"/>
+      <w:r>
+        <w:t>e_dense</w:t>
+      </w:r>
+      <w:proofErr w:type="spellEnd"/>
+      <w:r>
+        <w:t xml:space="preserve"> is extracted and normalized to unit length:</w:t>
       </w:r>
     </w:p>
     <w:tbl>
@@ -4575,22 +5173,26 @@
               <w:jc w:val="center"/>
             </w:pPr>
             <w:r>
+              <w:rPr>
+                <w:noProof/>
+              </w:rPr>
               <w:drawing>
-                <wp:inline xmlns:a="http://schemas.openxmlformats.org/drawingml/2006/main" xmlns:pic="http://schemas.openxmlformats.org/drawingml/2006/picture">
+                <wp:inline distT="0" distB="0" distL="0" distR="0" wp14:anchorId="1F30F0B1" wp14:editId="338E81FB">
                   <wp:extent cx="4983480" cy="666814"/>
+                  <wp:effectExtent l="0" t="0" r="0" b="0"/>
                   <wp:docPr id="22" name="Picture 22"/>
                   <wp:cNvGraphicFramePr>
-                    <a:graphicFrameLocks noChangeAspect="1"/>
+                    <a:graphicFrameLocks xmlns:a="http://schemas.openxmlformats.org/drawingml/2006/main" noChangeAspect="1"/>
                   </wp:cNvGraphicFramePr>
-                  <a:graphic>
+                  <a:graphic xmlns:a="http://schemas.openxmlformats.org/drawingml/2006/main">
                     <a:graphicData uri="http://schemas.openxmlformats.org/drawingml/2006/picture">
-                      <pic:pic>
+                      <pic:pic xmlns:pic="http://schemas.openxmlformats.org/drawingml/2006/picture">
                         <pic:nvPicPr>
                           <pic:cNvPr id="0" name="eq_17.png"/>
                           <pic:cNvPicPr/>
                         </pic:nvPicPr>
                         <pic:blipFill>
-                          <a:blip r:embed="rId29"/>
+                          <a:blip r:embed="rId24"/>
                           <a:stretch>
                             <a:fillRect/>
                           </a:stretch>
@@ -4600,7 +5202,9 @@
                             <a:off x="0" y="0"/>
                             <a:ext cx="4983480" cy="666814"/>
                           </a:xfrm>
-                          <a:prstGeom prst="rect"/>
+                          <a:prstGeom prst="rect">
+                            <a:avLst/>
+                          </a:prstGeom>
                         </pic:spPr>
                       </pic:pic>
                     </a:graphicData>
@@ -4620,10 +5224,6 @@
               <w:jc w:val="right"/>
             </w:pPr>
             <w:r>
-              <w:rPr>
-                <w:rFonts w:ascii="Times New Roman" w:hAnsi="Times New Roman"/>
-                <w:sz w:val="20"/>
-              </w:rPr>
               <w:t>(17)</w:t>
             </w:r>
           </w:p>
@@ -4632,12 +5232,23 @@
     </w:tbl>
     <w:p>
       <w:pPr>
-        <w:spacing w:after="40" w:before="40"/>
+        <w:spacing w:before="40" w:after="40"/>
       </w:pPr>
     </w:p>
     <w:p>
       <w:r>
-        <w:t>The normalized embeddings of all 1,848 training catalog images are indexed into an exact FAISS index (faiss.IndexFlatIP(256)). For any query footwear image, the inner product measures cosine similarity directly:</w:t>
+        <w:lastRenderedPageBreak/>
+        <w:t>The normalized embeddings of all 1,848 training catalog images are indexed into an exact FAISS index (</w:t>
+      </w:r>
+      <w:proofErr w:type="spellStart"/>
+      <w:proofErr w:type="gramStart"/>
+      <w:r>
+        <w:t>faiss.IndexFlatIP</w:t>
+      </w:r>
+      <w:proofErr w:type="spellEnd"/>
+      <w:proofErr w:type="gramEnd"/>
+      <w:r>
+        <w:t>(256)). For any query footwear image, the inner product measures cosine similarity directly:</w:t>
       </w:r>
     </w:p>
     <w:tbl>
@@ -4665,22 +5276,26 @@
               <w:jc w:val="center"/>
             </w:pPr>
             <w:r>
+              <w:rPr>
+                <w:noProof/>
+              </w:rPr>
               <w:drawing>
-                <wp:inline xmlns:a="http://schemas.openxmlformats.org/drawingml/2006/main" xmlns:pic="http://schemas.openxmlformats.org/drawingml/2006/picture">
+                <wp:inline distT="0" distB="0" distL="0" distR="0" wp14:anchorId="7D1D3F30" wp14:editId="660E1FCD">
                   <wp:extent cx="4983480" cy="666814"/>
+                  <wp:effectExtent l="0" t="0" r="0" b="0"/>
                   <wp:docPr id="23" name="Picture 23"/>
                   <wp:cNvGraphicFramePr>
-                    <a:graphicFrameLocks noChangeAspect="1"/>
+                    <a:graphicFrameLocks xmlns:a="http://schemas.openxmlformats.org/drawingml/2006/main" noChangeAspect="1"/>
                   </wp:cNvGraphicFramePr>
-                  <a:graphic>
+                  <a:graphic xmlns:a="http://schemas.openxmlformats.org/drawingml/2006/main">
                     <a:graphicData uri="http://schemas.openxmlformats.org/drawingml/2006/picture">
-                      <pic:pic>
+                      <pic:pic xmlns:pic="http://schemas.openxmlformats.org/drawingml/2006/picture">
                         <pic:nvPicPr>
                           <pic:cNvPr id="0" name="eq_18.png"/>
                           <pic:cNvPicPr/>
                         </pic:nvPicPr>
                         <pic:blipFill>
-                          <a:blip r:embed="rId30"/>
+                          <a:blip r:embed="rId25"/>
                           <a:stretch>
                             <a:fillRect/>
                           </a:stretch>
@@ -4690,7 +5305,9 @@
                             <a:off x="0" y="0"/>
                             <a:ext cx="4983480" cy="666814"/>
                           </a:xfrm>
-                          <a:prstGeom prst="rect"/>
+                          <a:prstGeom prst="rect">
+                            <a:avLst/>
+                          </a:prstGeom>
                         </pic:spPr>
                       </pic:pic>
                     </a:graphicData>
@@ -4710,10 +5327,6 @@
               <w:jc w:val="right"/>
             </w:pPr>
             <w:r>
-              <w:rPr>
-                <w:rFonts w:ascii="Times New Roman" w:hAnsi="Times New Roman"/>
-                <w:sz w:val="20"/>
-              </w:rPr>
               <w:t>(18)</w:t>
             </w:r>
           </w:p>
@@ -4722,12 +5335,36 @@
     </w:tbl>
     <w:p>
       <w:pPr>
-        <w:spacing w:after="40" w:before="40"/>
+        <w:spacing w:before="40" w:after="40"/>
       </w:pPr>
     </w:p>
     <w:p>
       <w:r>
-        <w:t>The engine queries the index to return the top-K (K=5) nearest catalog neighbors Omega_K(q) = {(g_{(1)}, s_1), ..., (g_{(K)}, s_K)}.</w:t>
+        <w:t xml:space="preserve">The engine queries the index to return the top-K (K=5) nearest catalog neighbors </w:t>
+      </w:r>
+      <w:proofErr w:type="spellStart"/>
+      <w:r>
+        <w:t>Omega_K</w:t>
+      </w:r>
+      <w:proofErr w:type="spellEnd"/>
+      <w:r>
+        <w:t>(q) = {(g</w:t>
+      </w:r>
+      <w:proofErr w:type="gramStart"/>
+      <w:r>
+        <w:t>_{</w:t>
+      </w:r>
+      <w:proofErr w:type="gramEnd"/>
+      <w:r>
+        <w:t xml:space="preserve">(1)}, s_1), ..., (g_{(K)}, </w:t>
+      </w:r>
+      <w:proofErr w:type="spellStart"/>
+      <w:r>
+        <w:t>s_K</w:t>
+      </w:r>
+      <w:proofErr w:type="spellEnd"/>
+      <w:r>
+        <w:t>)}.</w:t>
       </w:r>
     </w:p>
     <w:p>
@@ -4755,7 +5392,7 @@
                     <pic:cNvPicPr/>
                   </pic:nvPicPr>
                   <pic:blipFill>
-                    <a:blip r:embed="rId8"/>
+                    <a:blip r:embed="rId26"/>
                     <a:stretch>
                       <a:fillRect/>
                     </a:stretch>
@@ -4950,12 +5587,14 @@
               <w:spacing w:before="40" w:after="40" w:line="240" w:lineRule="auto"/>
               <w:jc w:val="left"/>
             </w:pPr>
+            <w:proofErr w:type="spellStart"/>
             <w:r>
               <w:rPr>
                 <w:sz w:val="17"/>
               </w:rPr>
               <w:t>image_input</w:t>
             </w:r>
+            <w:proofErr w:type="spellEnd"/>
           </w:p>
         </w:tc>
         <w:tc>
@@ -4967,12 +5606,14 @@
               <w:spacing w:before="40" w:after="40" w:line="240" w:lineRule="auto"/>
               <w:jc w:val="left"/>
             </w:pPr>
+            <w:proofErr w:type="spellStart"/>
             <w:r>
               <w:rPr>
                 <w:sz w:val="17"/>
               </w:rPr>
               <w:t>InputLayer</w:t>
             </w:r>
+            <w:proofErr w:type="spellEnd"/>
           </w:p>
         </w:tc>
         <w:tc>
@@ -5130,12 +5771,14 @@
               <w:spacing w:before="40" w:after="40" w:line="240" w:lineRule="auto"/>
               <w:jc w:val="left"/>
             </w:pPr>
+            <w:proofErr w:type="spellStart"/>
             <w:r>
               <w:rPr>
                 <w:sz w:val="17"/>
               </w:rPr>
               <w:t>global_avg_pool</w:t>
             </w:r>
+            <w:proofErr w:type="spellEnd"/>
           </w:p>
         </w:tc>
         <w:tc>
@@ -5220,12 +5863,14 @@
               <w:spacing w:before="40" w:after="40" w:line="240" w:lineRule="auto"/>
               <w:jc w:val="left"/>
             </w:pPr>
+            <w:proofErr w:type="spellStart"/>
             <w:r>
               <w:rPr>
                 <w:sz w:val="17"/>
               </w:rPr>
               <w:t>dense_penultimate</w:t>
             </w:r>
+            <w:proofErr w:type="spellEnd"/>
           </w:p>
         </w:tc>
         <w:tc>
@@ -5241,7 +5886,21 @@
               <w:rPr>
                 <w:sz w:val="17"/>
               </w:rPr>
-              <w:t>Dense (ReLU)</w:t>
+              <w:t>Dense (</w:t>
+            </w:r>
+            <w:proofErr w:type="spellStart"/>
+            <w:r>
+              <w:rPr>
+                <w:sz w:val="17"/>
+              </w:rPr>
+              <w:t>ReLU</w:t>
+            </w:r>
+            <w:proofErr w:type="spellEnd"/>
+            <w:r>
+              <w:rPr>
+                <w:sz w:val="17"/>
+              </w:rPr>
+              <w:t>)</w:t>
             </w:r>
           </w:p>
         </w:tc>
@@ -5390,7 +6049,7 @@
     </w:tbl>
     <w:p>
       <w:pPr>
-        <w:spacing w:after="40" w:before="40"/>
+        <w:spacing w:before="40" w:after="40"/>
       </w:pPr>
     </w:p>
     <w:p>
@@ -5413,12 +6072,36 @@
     </w:p>
     <w:p>
       <w:r>
-        <w:t>1. Metadata Authenticity Score (S_meta in [0, 1]): The predicted textual authenticity score from Subsystem 2, reflecting the absence of replica syntax and keyword stuffing.</w:t>
+        <w:t>1. Metadata Authenticity Score (</w:t>
+      </w:r>
+      <w:proofErr w:type="spellStart"/>
+      <w:r>
+        <w:t>S_meta</w:t>
+      </w:r>
+      <w:proofErr w:type="spellEnd"/>
+      <w:r>
+        <w:t xml:space="preserve"> in [0, 1]): The predicted textual authenticity score from Subsystem 2, reflecting the absence of replica syntax and keyword stuffing.</w:t>
       </w:r>
     </w:p>
     <w:p>
       <w:r>
-        <w:t>2. Brand Match Ratio (R_brand in [0, 1]): The fraction of the top-K (K=5) retrieved catalog images whose indexed brand matches the claimed query brand B_query extracted from the listing metadata:</w:t>
+        <w:t>2. Brand Match Ratio (</w:t>
+      </w:r>
+      <w:proofErr w:type="spellStart"/>
+      <w:r>
+        <w:t>R_brand</w:t>
+      </w:r>
+      <w:proofErr w:type="spellEnd"/>
+      <w:r>
+        <w:t xml:space="preserve"> in [0, 1]): The fraction of the top-K (K=5) retrieved catalog images whose indexed brand matches the claimed query brand </w:t>
+      </w:r>
+      <w:proofErr w:type="spellStart"/>
+      <w:r>
+        <w:t>B_query</w:t>
+      </w:r>
+      <w:proofErr w:type="spellEnd"/>
+      <w:r>
+        <w:t xml:space="preserve"> extracted from the listing metadata:</w:t>
       </w:r>
     </w:p>
     <w:tbl>
@@ -5446,22 +6129,26 @@
               <w:jc w:val="center"/>
             </w:pPr>
             <w:r>
+              <w:rPr>
+                <w:noProof/>
+              </w:rPr>
               <w:drawing>
-                <wp:inline xmlns:a="http://schemas.openxmlformats.org/drawingml/2006/main" xmlns:pic="http://schemas.openxmlformats.org/drawingml/2006/picture">
+                <wp:inline distT="0" distB="0" distL="0" distR="0" wp14:anchorId="46E6F5FB" wp14:editId="2577775A">
                   <wp:extent cx="4983480" cy="666814"/>
+                  <wp:effectExtent l="0" t="0" r="0" b="0"/>
                   <wp:docPr id="24" name="Picture 24"/>
                   <wp:cNvGraphicFramePr>
-                    <a:graphicFrameLocks noChangeAspect="1"/>
+                    <a:graphicFrameLocks xmlns:a="http://schemas.openxmlformats.org/drawingml/2006/main" noChangeAspect="1"/>
                   </wp:cNvGraphicFramePr>
-                  <a:graphic>
+                  <a:graphic xmlns:a="http://schemas.openxmlformats.org/drawingml/2006/main">
                     <a:graphicData uri="http://schemas.openxmlformats.org/drawingml/2006/picture">
-                      <pic:pic>
+                      <pic:pic xmlns:pic="http://schemas.openxmlformats.org/drawingml/2006/picture">
                         <pic:nvPicPr>
                           <pic:cNvPr id="0" name="eq_19.png"/>
                           <pic:cNvPicPr/>
                         </pic:nvPicPr>
                         <pic:blipFill>
-                          <a:blip r:embed="rId31"/>
+                          <a:blip r:embed="rId27"/>
                           <a:stretch>
                             <a:fillRect/>
                           </a:stretch>
@@ -5471,7 +6158,9 @@
                             <a:off x="0" y="0"/>
                             <a:ext cx="4983480" cy="666814"/>
                           </a:xfrm>
-                          <a:prstGeom prst="rect"/>
+                          <a:prstGeom prst="rect">
+                            <a:avLst/>
+                          </a:prstGeom>
                         </pic:spPr>
                       </pic:pic>
                     </a:graphicData>
@@ -5491,10 +6180,6 @@
               <w:jc w:val="right"/>
             </w:pPr>
             <w:r>
-              <w:rPr>
-                <w:rFonts w:ascii="Times New Roman" w:hAnsi="Times New Roman"/>
-                <w:sz w:val="20"/>
-              </w:rPr>
               <w:t>(19)</w:t>
             </w:r>
           </w:p>
@@ -5503,12 +6188,20 @@
     </w:tbl>
     <w:p>
       <w:pPr>
-        <w:spacing w:after="40" w:before="40"/>
+        <w:spacing w:before="40" w:after="40"/>
       </w:pPr>
     </w:p>
     <w:p>
       <w:r>
-        <w:t>3. Mean Top-K Retrieval Similarity / Retrieval Confidence (C_ret in [0, 1]): The average cosine similarity across the top-K retrieved catalog vectors:</w:t>
+        <w:t>3. Mean Top-K Retrieval Similarity / Retrieval Confidence (</w:t>
+      </w:r>
+      <w:proofErr w:type="spellStart"/>
+      <w:r>
+        <w:t>C_ret</w:t>
+      </w:r>
+      <w:proofErr w:type="spellEnd"/>
+      <w:r>
+        <w:t xml:space="preserve"> in [0, 1]): The average cosine similarity across the top-K retrieved catalog vectors:</w:t>
       </w:r>
     </w:p>
     <w:tbl>
@@ -5536,22 +6229,26 @@
               <w:jc w:val="center"/>
             </w:pPr>
             <w:r>
+              <w:rPr>
+                <w:noProof/>
+              </w:rPr>
               <w:drawing>
-                <wp:inline xmlns:a="http://schemas.openxmlformats.org/drawingml/2006/main" xmlns:pic="http://schemas.openxmlformats.org/drawingml/2006/picture">
+                <wp:inline distT="0" distB="0" distL="0" distR="0" wp14:anchorId="732A7103" wp14:editId="3E3E7E92">
                   <wp:extent cx="4983480" cy="666814"/>
+                  <wp:effectExtent l="0" t="0" r="0" b="0"/>
                   <wp:docPr id="25" name="Picture 25"/>
                   <wp:cNvGraphicFramePr>
-                    <a:graphicFrameLocks noChangeAspect="1"/>
+                    <a:graphicFrameLocks xmlns:a="http://schemas.openxmlformats.org/drawingml/2006/main" noChangeAspect="1"/>
                   </wp:cNvGraphicFramePr>
-                  <a:graphic>
+                  <a:graphic xmlns:a="http://schemas.openxmlformats.org/drawingml/2006/main">
                     <a:graphicData uri="http://schemas.openxmlformats.org/drawingml/2006/picture">
-                      <pic:pic>
+                      <pic:pic xmlns:pic="http://schemas.openxmlformats.org/drawingml/2006/picture">
                         <pic:nvPicPr>
                           <pic:cNvPr id="0" name="eq_20.png"/>
                           <pic:cNvPicPr/>
                         </pic:nvPicPr>
                         <pic:blipFill>
-                          <a:blip r:embed="rId32"/>
+                          <a:blip r:embed="rId28"/>
                           <a:stretch>
                             <a:fillRect/>
                           </a:stretch>
@@ -5561,7 +6258,9 @@
                             <a:off x="0" y="0"/>
                             <a:ext cx="4983480" cy="666814"/>
                           </a:xfrm>
-                          <a:prstGeom prst="rect"/>
+                          <a:prstGeom prst="rect">
+                            <a:avLst/>
+                          </a:prstGeom>
                         </pic:spPr>
                       </pic:pic>
                     </a:graphicData>
@@ -5581,10 +6280,6 @@
               <w:jc w:val="right"/>
             </w:pPr>
             <w:r>
-              <w:rPr>
-                <w:rFonts w:ascii="Times New Roman" w:hAnsi="Times New Roman"/>
-                <w:sz w:val="20"/>
-              </w:rPr>
               <w:t>(20)</w:t>
             </w:r>
           </w:p>
@@ -5593,7 +6288,7 @@
     </w:tbl>
     <w:p>
       <w:pPr>
-        <w:spacing w:after="40" w:before="40"/>
+        <w:spacing w:before="40" w:after="40"/>
       </w:pPr>
     </w:p>
     <w:p>
@@ -5626,22 +6321,26 @@
               <w:jc w:val="center"/>
             </w:pPr>
             <w:r>
+              <w:rPr>
+                <w:noProof/>
+              </w:rPr>
               <w:drawing>
-                <wp:inline xmlns:a="http://schemas.openxmlformats.org/drawingml/2006/main" xmlns:pic="http://schemas.openxmlformats.org/drawingml/2006/picture">
+                <wp:inline distT="0" distB="0" distL="0" distR="0" wp14:anchorId="7E8A71E4" wp14:editId="20402347">
                   <wp:extent cx="4983480" cy="666814"/>
+                  <wp:effectExtent l="0" t="0" r="0" b="0"/>
                   <wp:docPr id="26" name="Picture 26"/>
                   <wp:cNvGraphicFramePr>
-                    <a:graphicFrameLocks noChangeAspect="1"/>
+                    <a:graphicFrameLocks xmlns:a="http://schemas.openxmlformats.org/drawingml/2006/main" noChangeAspect="1"/>
                   </wp:cNvGraphicFramePr>
-                  <a:graphic>
+                  <a:graphic xmlns:a="http://schemas.openxmlformats.org/drawingml/2006/main">
                     <a:graphicData uri="http://schemas.openxmlformats.org/drawingml/2006/picture">
-                      <pic:pic>
+                      <pic:pic xmlns:pic="http://schemas.openxmlformats.org/drawingml/2006/picture">
                         <pic:nvPicPr>
                           <pic:cNvPr id="0" name="eq_21.png"/>
                           <pic:cNvPicPr/>
                         </pic:nvPicPr>
                         <pic:blipFill>
-                          <a:blip r:embed="rId33"/>
+                          <a:blip r:embed="rId29"/>
                           <a:stretch>
                             <a:fillRect/>
                           </a:stretch>
@@ -5651,7 +6350,9 @@
                             <a:off x="0" y="0"/>
                             <a:ext cx="4983480" cy="666814"/>
                           </a:xfrm>
-                          <a:prstGeom prst="rect"/>
+                          <a:prstGeom prst="rect">
+                            <a:avLst/>
+                          </a:prstGeom>
                         </pic:spPr>
                       </pic:pic>
                     </a:graphicData>
@@ -5671,10 +6372,6 @@
               <w:jc w:val="right"/>
             </w:pPr>
             <w:r>
-              <w:rPr>
-                <w:rFonts w:ascii="Times New Roman" w:hAnsi="Times New Roman"/>
-                <w:sz w:val="20"/>
-              </w:rPr>
               <w:t>(21)</w:t>
             </w:r>
           </w:p>
@@ -5683,7 +6380,7 @@
     </w:tbl>
     <w:p>
       <w:pPr>
-        <w:spacing w:after="40" w:before="40"/>
+        <w:spacing w:before="40" w:after="40"/>
       </w:pPr>
     </w:p>
     <w:p>
@@ -5716,22 +6413,26 @@
               <w:jc w:val="center"/>
             </w:pPr>
             <w:r>
+              <w:rPr>
+                <w:noProof/>
+              </w:rPr>
               <w:drawing>
-                <wp:inline xmlns:a="http://schemas.openxmlformats.org/drawingml/2006/main" xmlns:pic="http://schemas.openxmlformats.org/drawingml/2006/picture">
+                <wp:inline distT="0" distB="0" distL="0" distR="0" wp14:anchorId="5796208D" wp14:editId="356B9F2F">
                   <wp:extent cx="4983480" cy="789447"/>
+                  <wp:effectExtent l="0" t="0" r="0" b="0"/>
                   <wp:docPr id="27" name="Picture 27"/>
                   <wp:cNvGraphicFramePr>
-                    <a:graphicFrameLocks noChangeAspect="1"/>
+                    <a:graphicFrameLocks xmlns:a="http://schemas.openxmlformats.org/drawingml/2006/main" noChangeAspect="1"/>
                   </wp:cNvGraphicFramePr>
-                  <a:graphic>
+                  <a:graphic xmlns:a="http://schemas.openxmlformats.org/drawingml/2006/main">
                     <a:graphicData uri="http://schemas.openxmlformats.org/drawingml/2006/picture">
-                      <pic:pic>
+                      <pic:pic xmlns:pic="http://schemas.openxmlformats.org/drawingml/2006/picture">
                         <pic:nvPicPr>
                           <pic:cNvPr id="0" name="eq_22.png"/>
                           <pic:cNvPicPr/>
                         </pic:nvPicPr>
                         <pic:blipFill>
-                          <a:blip r:embed="rId34"/>
+                          <a:blip r:embed="rId30"/>
                           <a:stretch>
                             <a:fillRect/>
                           </a:stretch>
@@ -5741,7 +6442,9 @@
                             <a:off x="0" y="0"/>
                             <a:ext cx="4983480" cy="789447"/>
                           </a:xfrm>
-                          <a:prstGeom prst="rect"/>
+                          <a:prstGeom prst="rect">
+                            <a:avLst/>
+                          </a:prstGeom>
                         </pic:spPr>
                       </pic:pic>
                     </a:graphicData>
@@ -5761,10 +6464,6 @@
               <w:jc w:val="right"/>
             </w:pPr>
             <w:r>
-              <w:rPr>
-                <w:rFonts w:ascii="Times New Roman" w:hAnsi="Times New Roman"/>
-                <w:sz w:val="20"/>
-              </w:rPr>
               <w:t>(22)</w:t>
             </w:r>
           </w:p>
@@ -5773,7 +6472,7 @@
     </w:tbl>
     <w:p>
       <w:pPr>
-        <w:spacing w:after="40" w:before="40"/>
+        <w:spacing w:before="40" w:after="40"/>
       </w:pPr>
     </w:p>
     <w:p>
@@ -5785,7 +6484,6 @@
         <w:rPr>
           <w:noProof/>
         </w:rPr>
-        <w:lastRenderedPageBreak/>
         <w:drawing>
           <wp:inline distT="0" distB="0" distL="0" distR="0" wp14:anchorId="4762504B" wp14:editId="4FEAC07A">
             <wp:extent cx="5717674" cy="1193800"/>
@@ -5802,7 +6500,7 @@
                     <pic:cNvPicPr/>
                   </pic:nvPicPr>
                   <pic:blipFill>
-                    <a:blip r:embed="rId9"/>
+                    <a:blip r:embed="rId31"/>
                     <a:stretch>
                       <a:fillRect/>
                     </a:stretch>
@@ -5870,7 +6568,15 @@
     </w:p>
     <w:p>
       <w:r>
-        <w:t>The Dual-Branch Fake Review Detector was evaluated on the 365 test review samples. Training converged rapidly by epoch 2 (val_loss: 0.0820). On the held-out test split, the model achieved a test loss of 0.08199 and a test accuracy of 96.99% (354 out of 365 correct predictions). Table 5 presents the complete classification report.</w:t>
+        <w:t>The Dual-Branch Fake Review Detector was evaluated on the 365 test review samples. Training converged rapidly by epoch 2 (</w:t>
+      </w:r>
+      <w:proofErr w:type="spellStart"/>
+      <w:r>
+        <w:t>val_loss</w:t>
+      </w:r>
+      <w:proofErr w:type="spellEnd"/>
+      <w:r>
+        <w:t>: 0.0820). On the held-out test split, the model achieved a test loss of 0.08199 and a test accuracy of 96.99% (354 out of 365 correct predictions). Table 5 presents the complete classification report.</w:t>
       </w:r>
     </w:p>
     <w:p>
@@ -6473,12 +7179,16 @@
     </w:tbl>
     <w:p>
       <w:pPr>
-        <w:spacing w:after="40" w:before="40"/>
+        <w:spacing w:before="40" w:after="40"/>
       </w:pPr>
     </w:p>
     <w:p>
       <w:r>
-        <w:t>The resulting confusion matrix demonstrates strong sensitivity toward deceptive opinion spam: [[182, 9], [2, 172]]. The model correctly detected 172 out of 174 fraudulent reviews (Recall: 98.85%), with only 2 false negatives. Authentic reviews achieved 98.91% precision, with only 9 legitimate reviews misclassified as spam (False Positive Rate: 4.71%).</w:t>
+        <w:t xml:space="preserve">The resulting confusion matrix demonstrates strong sensitivity toward deceptive opinion spam: [[182, 9], [2, 172]]. The model correctly detected 172 out of 174 fraudulent reviews (Recall: 98.85%), with only 2 false negatives. </w:t>
+      </w:r>
+      <w:r>
+        <w:lastRenderedPageBreak/>
+        <w:t>Authentic reviews achieved 98.91% precision, with only 9 legitimate reviews misclassified as spam (False Positive Rate: 4.71%).</w:t>
       </w:r>
     </w:p>
     <w:p>
@@ -6509,7 +7219,23 @@
           <w:b/>
           <w:sz w:val="19"/>
         </w:rPr>
-        <w:t>Table 6 Classification performance of the Sequential BiLSTM Metadata Classifier</w:t>
+        <w:t xml:space="preserve">Table 6 Classification performance of the Sequential </w:t>
+      </w:r>
+      <w:proofErr w:type="spellStart"/>
+      <w:r>
+        <w:rPr>
+          <w:b/>
+          <w:sz w:val="19"/>
+        </w:rPr>
+        <w:t>BiLSTM</w:t>
+      </w:r>
+      <w:proofErr w:type="spellEnd"/>
+      <w:r>
+        <w:rPr>
+          <w:b/>
+          <w:sz w:val="19"/>
+        </w:rPr>
+        <w:t xml:space="preserve"> Metadata Classifier</w:t>
       </w:r>
     </w:p>
     <w:tbl>
@@ -6933,7 +7659,6 @@
               <w:rPr>
                 <w:sz w:val="17"/>
               </w:rPr>
-              <w:lastRenderedPageBreak/>
               <w:t>Macro Average</w:t>
             </w:r>
           </w:p>
@@ -7100,7 +7825,7 @@
     </w:tbl>
     <w:p>
       <w:pPr>
-        <w:spacing w:after="40" w:before="40"/>
+        <w:spacing w:before="40" w:after="40"/>
       </w:pPr>
     </w:p>
     <w:p>
@@ -7131,7 +7856,23 @@
           <w:b/>
           <w:sz w:val="19"/>
         </w:rPr>
-        <w:t>Table 7 Multi-class classification report of the Fine-Tuned ResNet-50 Brand Classifier</w:t>
+        <w:t xml:space="preserve">Table 7 </w:t>
+      </w:r>
+      <w:proofErr w:type="gramStart"/>
+      <w:r>
+        <w:rPr>
+          <w:b/>
+          <w:sz w:val="19"/>
+        </w:rPr>
+        <w:t>Multi-class</w:t>
+      </w:r>
+      <w:proofErr w:type="gramEnd"/>
+      <w:r>
+        <w:rPr>
+          <w:b/>
+          <w:sz w:val="19"/>
+        </w:rPr>
+        <w:t xml:space="preserve"> classification report of the Fine-Tuned ResNet-50 Brand Classifier</w:t>
       </w:r>
     </w:p>
     <w:tbl>
@@ -7281,12 +8022,14 @@
               <w:spacing w:before="40" w:after="40" w:line="240" w:lineRule="auto"/>
               <w:jc w:val="left"/>
             </w:pPr>
+            <w:proofErr w:type="spellStart"/>
             <w:r>
               <w:rPr>
                 <w:sz w:val="17"/>
               </w:rPr>
               <w:t>newbalance</w:t>
             </w:r>
+            <w:proofErr w:type="spellEnd"/>
           </w:p>
         </w:tc>
         <w:tc>
@@ -7371,12 +8114,14 @@
               <w:spacing w:before="40" w:after="40" w:line="240" w:lineRule="auto"/>
               <w:jc w:val="left"/>
             </w:pPr>
+            <w:proofErr w:type="spellStart"/>
             <w:r>
               <w:rPr>
                 <w:sz w:val="17"/>
               </w:rPr>
               <w:t>nike</w:t>
             </w:r>
+            <w:proofErr w:type="spellEnd"/>
           </w:p>
         </w:tc>
         <w:tc>
@@ -7641,12 +8386,14 @@
               <w:spacing w:before="40" w:after="40" w:line="240" w:lineRule="auto"/>
               <w:jc w:val="left"/>
             </w:pPr>
+            <w:proofErr w:type="spellStart"/>
             <w:r>
               <w:rPr>
                 <w:sz w:val="17"/>
               </w:rPr>
               <w:t>underarmour</w:t>
             </w:r>
+            <w:proofErr w:type="spellEnd"/>
           </w:p>
         </w:tc>
         <w:tc>
@@ -8081,12 +8828,28 @@
     </w:tbl>
     <w:p>
       <w:pPr>
-        <w:spacing w:after="40" w:before="40"/>
+        <w:spacing w:before="40" w:after="40"/>
       </w:pPr>
     </w:p>
     <w:p>
       <w:r>
-        <w:t>Following feature extraction and L2 normalization, the 256-D penultimate embeddings of the 1,848 training images were indexed into FAISS IndexFlatIP. Retrieval evaluations across the 397 validation and 397 test query images demonstrated that metric retrieval substantially outperforms fixed-head softmax classification, reaching 90.6801% Top-1 accuracy and 93.9547% Top-5 accuracy. Tables 8 and 9 report overall and per-brand retrieval results.</w:t>
+        <w:t xml:space="preserve">Following feature extraction and L2 normalization, the 256-D penultimate embeddings of the 1,848 training images were indexed into FAISS </w:t>
+      </w:r>
+      <w:proofErr w:type="spellStart"/>
+      <w:r>
+        <w:t>IndexFlatIP</w:t>
+      </w:r>
+      <w:proofErr w:type="spellEnd"/>
+      <w:r>
+        <w:t xml:space="preserve">. Retrieval evaluations across the 397 validation and 397 test query images demonstrated that metric retrieval substantially outperforms fixed-head </w:t>
+      </w:r>
+      <w:proofErr w:type="spellStart"/>
+      <w:r>
+        <w:t>softmax</w:t>
+      </w:r>
+      <w:proofErr w:type="spellEnd"/>
+      <w:r>
+        <w:t xml:space="preserve"> classification, reaching 90.6801% Top-1 accuracy and 93.9547% Top-5 accuracy. Tables 8 and 9 report overall and per-brand retrieval results.</w:t>
       </w:r>
     </w:p>
     <w:p>
@@ -8099,7 +8862,23 @@
           <w:b/>
           <w:sz w:val="19"/>
         </w:rPr>
-        <w:t>Table 8 Nearest-neighbor visual retrieval accuracy using FAISS IndexFlatIP (256-D)</w:t>
+        <w:t xml:space="preserve">Table 8 Nearest-neighbor visual retrieval accuracy using FAISS </w:t>
+      </w:r>
+      <w:proofErr w:type="spellStart"/>
+      <w:r>
+        <w:rPr>
+          <w:b/>
+          <w:sz w:val="19"/>
+        </w:rPr>
+        <w:t>IndexFlatIP</w:t>
+      </w:r>
+      <w:proofErr w:type="spellEnd"/>
+      <w:r>
+        <w:rPr>
+          <w:b/>
+          <w:sz w:val="19"/>
+        </w:rPr>
+        <w:t xml:space="preserve"> (256-D)</w:t>
       </w:r>
     </w:p>
     <w:tbl>
@@ -8362,7 +9141,7 @@
     </w:tbl>
     <w:p>
       <w:pPr>
-        <w:spacing w:after="40" w:before="40"/>
+        <w:spacing w:before="40" w:after="40"/>
       </w:pPr>
     </w:p>
     <w:p>
@@ -8525,12 +9304,14 @@
               <w:spacing w:before="40" w:after="40" w:line="240" w:lineRule="auto"/>
               <w:jc w:val="left"/>
             </w:pPr>
+            <w:proofErr w:type="spellStart"/>
             <w:r>
               <w:rPr>
                 <w:sz w:val="17"/>
               </w:rPr>
               <w:t>newbalance</w:t>
             </w:r>
+            <w:proofErr w:type="spellEnd"/>
           </w:p>
         </w:tc>
         <w:tc>
@@ -8615,12 +9396,14 @@
               <w:spacing w:before="40" w:after="40" w:line="240" w:lineRule="auto"/>
               <w:jc w:val="left"/>
             </w:pPr>
+            <w:proofErr w:type="spellStart"/>
             <w:r>
               <w:rPr>
                 <w:sz w:val="17"/>
               </w:rPr>
               <w:t>nike</w:t>
             </w:r>
+            <w:proofErr w:type="spellEnd"/>
           </w:p>
         </w:tc>
         <w:tc>
@@ -8885,12 +9668,14 @@
               <w:spacing w:before="40" w:after="40" w:line="240" w:lineRule="auto"/>
               <w:jc w:val="left"/>
             </w:pPr>
+            <w:proofErr w:type="spellStart"/>
             <w:r>
               <w:rPr>
                 <w:sz w:val="17"/>
               </w:rPr>
               <w:t>underarmour</w:t>
             </w:r>
+            <w:proofErr w:type="spellEnd"/>
           </w:p>
         </w:tc>
         <w:tc>
@@ -9055,7 +9840,7 @@
     </w:tbl>
     <w:p>
       <w:pPr>
-        <w:spacing w:after="40" w:before="40"/>
+        <w:spacing w:before="40" w:after="40"/>
       </w:pPr>
     </w:p>
     <w:p>
@@ -9067,7 +9852,6 @@
         <w:rPr>
           <w:noProof/>
         </w:rPr>
-        <w:lastRenderedPageBreak/>
         <w:drawing>
           <wp:inline distT="0" distB="0" distL="0" distR="0" wp14:anchorId="56EE6F00" wp14:editId="7A174154">
             <wp:extent cx="5384800" cy="3384181"/>
@@ -9084,7 +9868,7 @@
                     <pic:cNvPicPr/>
                   </pic:nvPicPr>
                   <pic:blipFill>
-                    <a:blip r:embed="rId10"/>
+                    <a:blip r:embed="rId32"/>
                     <a:stretch>
                       <a:fillRect/>
                     </a:stretch>
@@ -9538,6 +10322,7 @@
               <w:rPr>
                 <w:sz w:val="17"/>
               </w:rPr>
+              <w:lastRenderedPageBreak/>
               <w:t>3. Unseen + Brand Mismatch (N=30)</w:t>
             </w:r>
           </w:p>
@@ -9738,7 +10523,7 @@
     </w:tbl>
     <w:p>
       <w:pPr>
-        <w:spacing w:after="40" w:before="40"/>
+        <w:spacing w:before="40" w:after="40"/>
       </w:pPr>
     </w:p>
     <w:p>
@@ -10168,7 +10953,6 @@
           <w:b/>
           <w:sz w:val="26"/>
         </w:rPr>
-        <w:lastRenderedPageBreak/>
         <w:t>5 Discussion</w:t>
       </w:r>
     </w:p>
@@ -10192,7 +10976,15 @@
     </w:p>
     <w:p>
       <w:r>
-        <w:t>The Dual-Branch Fake Review Detector achieved 96.99% accuracy on verified e-commerce reviews, significantly exceeding traditional text-only classifiers. Conventional NLP methods assume that deceptive intent is conveyed entirely through lexical choice. However, in practical e-commerce ecosystems, deceptive actors deliberately craft benign, positive-sounding text passages while inflating ratings, or post subtly mismatched feedback. By merging the 64-dimensional BiLSTM context vector with a dedicated 16-dimensional rating embedding, the network explicitly learns the non-linear interaction between sentiment polarity and quantitative scores. The resulting 98.85% recall on fraudulent reviews demonstrates that the dual-branch architecture catches deceptive feedback reliably while maintaining high precision on authentic customer reviews (98.91%).</w:t>
+        <w:t xml:space="preserve">The Dual-Branch Fake Review Detector achieved 96.99% accuracy on verified e-commerce reviews, significantly exceeding traditional text-only classifiers. Conventional NLP methods assume that deceptive intent is conveyed entirely through lexical choice. However, in practical e-commerce ecosystems, deceptive actors deliberately craft benign, positive-sounding text passages while inflating ratings, or post subtly mismatched feedback. By merging the 64-dimensional </w:t>
+      </w:r>
+      <w:proofErr w:type="spellStart"/>
+      <w:r>
+        <w:t>BiLSTM</w:t>
+      </w:r>
+      <w:proofErr w:type="spellEnd"/>
+      <w:r>
+        <w:t xml:space="preserve"> context vector with a dedicated 16-dimensional rating embedding, the network explicitly learns the non-linear interaction between sentiment polarity and quantitative scores. The resulting 98.85% recall on fraudulent reviews demonstrates that the dual-branch architecture catches deceptive feedback reliably while maintaining high precision on authentic customer reviews (98.91%).</w:t>
       </w:r>
     </w:p>
     <w:p>
@@ -10205,12 +10997,36 @@
           <w:b/>
           <w:sz w:val="22"/>
         </w:rPr>
-        <w:t>5.2 Continuous Metric Retrieval vs. Closed-Set Softmax Classification</w:t>
+        <w:t xml:space="preserve">5.2 Continuous Metric Retrieval vs. Closed-Set </w:t>
+      </w:r>
+      <w:proofErr w:type="spellStart"/>
+      <w:r>
+        <w:rPr>
+          <w:b/>
+          <w:sz w:val="22"/>
+        </w:rPr>
+        <w:t>Softmax</w:t>
+      </w:r>
+      <w:proofErr w:type="spellEnd"/>
+      <w:r>
+        <w:rPr>
+          <w:b/>
+          <w:sz w:val="22"/>
+        </w:rPr>
+        <w:t xml:space="preserve"> Classification</w:t>
       </w:r>
     </w:p>
     <w:p>
       <w:r>
-        <w:t>The visual subsystem results demonstrate the clear operational advantages of metric retrieval over closed-set classifiers. While the 6-way ResNet-50 brand classifier achieved 88.66% test accuracy, querying the 256-dimensional penultimate feature space via FAISS IndexFlatIP elevated retrieval accuracy to 90.68% for Top-1 and 93.95% for Top-5 nearest neighbors. The continuous metric space allows query embeddings to cluster around specific product sub-categories (e.g., canvas skate shoes vs. running silhouettes) rather than forcing an arbitrary linear decision boundary. Crucially, the FAISS vector index supports dynamic catalog expansion: new authentic inventory can be indexed instantaneously via vector addition without requiring costly network retraining.</w:t>
+        <w:t xml:space="preserve">The visual subsystem results demonstrate the clear operational advantages of metric retrieval over closed-set classifiers. While the 6-way ResNet-50 brand classifier achieved 88.66% test accuracy, querying the 256-dimensional penultimate feature space via FAISS </w:t>
+      </w:r>
+      <w:proofErr w:type="spellStart"/>
+      <w:r>
+        <w:t>IndexFlatIP</w:t>
+      </w:r>
+      <w:proofErr w:type="spellEnd"/>
+      <w:r>
+        <w:t xml:space="preserve"> elevated retrieval accuracy to 90.68% for Top-1 and 93.95% for Top-5 nearest neighbors. The continuous metric space allows query embeddings to cluster around specific product sub-categories (e.g., canvas skate shoes vs. running silhouettes) rather than forcing an arbitrary linear decision boundary. Crucially, the FAISS vector index supports dynamic catalog expansion: new authentic inventory can be indexed instantaneously via vector addition without requiring costly network retraining.</w:t>
       </w:r>
     </w:p>
     <w:p>
@@ -10241,21 +11057,42 @@
           <w:b/>
           <w:sz w:val="26"/>
         </w:rPr>
+        <w:lastRenderedPageBreak/>
         <w:t>6 Conclusion</w:t>
       </w:r>
     </w:p>
     <w:p>
       <w:r>
-        <w:t>This research designed, implemented, and evaluated a comprehensive multimodal deep learning framework for fake review identification and counterfeit product detection in modern e-commerce marketplaces. The system integrates three domain-specialized deep learning components: a dual-branch text-and-rating BiLSTM neural network for fake review detection (96.99% accuracy, 0.97 F1-score); a sequential BiLSTM metadata authenticity classifier for detecting replica phrasing and deceptive catalog descriptions (100.00% accuracy); and a visual similarity retrieval engine employing a fine-tuned ResNet-50 brand feature extractor coupled with a 256-dimensional FAISS IndexFlatIP vector index (93.95% Top-5 visual retrieval accuracy across 1,848 reference catalog images).</w:t>
+        <w:t xml:space="preserve">This research designed, implemented, and evaluated a comprehensive multimodal deep learning framework for fake review identification and counterfeit product detection in modern e-commerce marketplaces. The system integrates three domain-specialized deep learning components: a dual-branch text-and-rating </w:t>
+      </w:r>
+      <w:proofErr w:type="spellStart"/>
+      <w:r>
+        <w:t>BiLSTM</w:t>
+      </w:r>
+      <w:proofErr w:type="spellEnd"/>
+      <w:r>
+        <w:t xml:space="preserve"> neural network for fake review detection (96.99% accuracy, 0.97 F1-score); a sequential </w:t>
+      </w:r>
+      <w:proofErr w:type="spellStart"/>
+      <w:r>
+        <w:t>BiLSTM</w:t>
+      </w:r>
+      <w:proofErr w:type="spellEnd"/>
+      <w:r>
+        <w:t xml:space="preserve"> metadata authenticity classifier for detecting replica phrasing and deceptive catalog descriptions (100.00% accuracy); and a visual similarity retrieval engine employing a fine-tuned ResNet-50 brand feature extractor coupled with a 256-dimensional FAISS </w:t>
+      </w:r>
+      <w:proofErr w:type="spellStart"/>
+      <w:r>
+        <w:t>IndexFlatIP</w:t>
+      </w:r>
+      <w:proofErr w:type="spellEnd"/>
+      <w:r>
+        <w:t xml:space="preserve"> vector index (93.95% Top-5 visual retrieval accuracy across 1,848 reference catalog images).</w:t>
       </w:r>
     </w:p>
     <w:p>
       <w:r>
-        <w:t xml:space="preserve">To synthesize these signals without the vulnerabilities of monolithic joint encoders, a Three-Signal Late Trust Fusion Engine calculates an interpretable composite trust score by weighting metadata authenticity (0.50), visual brand match ratio (0.35), and mean retrieval similarity (0.15). Comprehensive evaluations across four operational scenarios demonstrate up to 100.00% counterfeit detection under adversarial attacks, while preserving high </w:t>
-      </w:r>
-      <w:r>
-        <w:lastRenderedPageBreak/>
-        <w:t>classification precision on authentic merchandise (95.24%). The modular architecture offers high operational scalability, enabling real-time deployment and dynamic catalog expansion across digital retail platforms.</w:t>
+        <w:t>To synthesize these signals without the vulnerabilities of monolithic joint encoders, a Three-Signal Late Trust Fusion Engine calculates an interpretable composite trust score by weighting metadata authenticity (0.50), visual brand match ratio (0.35), and mean retrieval similarity (0.15). Comprehensive evaluations across four operational scenarios demonstrate up to 100.00% counterfeit detection under adversarial attacks, while preserving high classification precision on authentic merchandise (95.24%). The modular architecture offers high operational scalability, enabling real-time deployment and dynamic catalog expansion across digital retail platforms.</w:t>
       </w:r>
     </w:p>
     <w:p>
@@ -10273,7 +11110,23 @@
     </w:p>
     <w:p>
       <w:r>
-        <w:t>While the proposed framework demonstrates strong empirical performance, several avenues remain for future exploration: (1) expanding the visual retrieval catalog beyond footwear to encompass luxury apparel, electronics, and cosmetics; (2) incorporating fine-grained hierarchical retrieval to verify specific product sub-models and manufacturing batches; (3) evaluating transformer backbones (such as DistilBERT or RoBERTa) for processing multi-sentence product descriptions; and (4) modeling reviewer networks through graph neural networks (GNNs) to identify organized review syndicates and automated spam rings.</w:t>
+        <w:t xml:space="preserve">While the proposed framework demonstrates strong empirical performance, several avenues remain for future exploration: (1) expanding the visual retrieval catalog beyond footwear to encompass luxury apparel, electronics, and cosmetics; (2) incorporating fine-grained hierarchical retrieval to verify specific product sub-models and manufacturing batches; (3) evaluating transformer backbones (such as </w:t>
+      </w:r>
+      <w:proofErr w:type="spellStart"/>
+      <w:r>
+        <w:t>DistilBERT</w:t>
+      </w:r>
+      <w:proofErr w:type="spellEnd"/>
+      <w:r>
+        <w:t xml:space="preserve"> or </w:t>
+      </w:r>
+      <w:proofErr w:type="spellStart"/>
+      <w:r>
+        <w:t>RoBERTa</w:t>
+      </w:r>
+      <w:proofErr w:type="spellEnd"/>
+      <w:r>
+        <w:t>) for processing multi-sentence product descriptions; and (4) modeling reviewer networks through graph neural networks (GNNs) to identify organized review syndicates and automated spam rings.</w:t>
       </w:r>
     </w:p>
     <w:p>
@@ -10292,33 +11145,144 @@
     <w:p>
       <w:pPr>
         <w:spacing w:after="40"/>
+        <w:rPr>
+          <w:lang w:val="en-IN"/>
+        </w:rPr>
       </w:pPr>
       <w:r>
-        <w:t>Funding: No specific funding was received for conducting this study.</w:t>
-      </w:r>
+        <w:rPr>
+          <w:b/>
+          <w:bCs/>
+          <w:lang w:val="en-IN"/>
+        </w:rPr>
+        <w:t>Availability of data and material:</w:t>
+      </w:r>
+      <w:r>
+        <w:rPr>
+          <w:lang w:val="en-IN"/>
+        </w:rPr>
+        <w:t xml:space="preserve"> </w:t>
+      </w:r>
+      <w:r>
+        <w:rPr>
+          <w:lang w:val="en-IN"/>
+        </w:rPr>
+        <w:t>My manuscript has associated data in a data repository.</w:t>
+      </w:r>
+    </w:p>
+    <w:p>
+      <w:pPr>
+        <w:spacing w:after="40"/>
+        <w:rPr>
+          <w:lang w:val="en-IN"/>
+        </w:rPr>
+      </w:pPr>
+      <w:r>
+        <w:rPr>
+          <w:b/>
+          <w:bCs/>
+          <w:lang w:val="en-IN"/>
+        </w:rPr>
+        <w:t>Competing interests:</w:t>
+      </w:r>
+      <w:r>
+        <w:rPr>
+          <w:lang w:val="en-IN"/>
+        </w:rPr>
+        <w:t xml:space="preserve"> The authors declare that they have no known competing financial interests or personal relationships that could have appeared to influence the work reported in this paper.</w:t>
+      </w:r>
+    </w:p>
+    <w:p>
+      <w:pPr>
+        <w:spacing w:after="40"/>
+        <w:rPr>
+          <w:lang w:val="en-IN"/>
+        </w:rPr>
+      </w:pPr>
+      <w:r>
+        <w:rPr>
+          <w:b/>
+          <w:bCs/>
+          <w:lang w:val="en-IN"/>
+        </w:rPr>
+        <w:t>Funding:</w:t>
+      </w:r>
+      <w:r>
+        <w:rPr>
+          <w:lang w:val="en-IN"/>
+        </w:rPr>
+        <w:t xml:space="preserve"> No specific funding was received for conducting this study.</w:t>
+      </w:r>
+    </w:p>
+    <w:p>
+      <w:pPr>
+        <w:spacing w:after="40"/>
+        <w:rPr>
+          <w:lang w:val="en-IN"/>
+        </w:rPr>
+      </w:pPr>
+      <w:r>
+        <w:rPr>
+          <w:b/>
+          <w:bCs/>
+          <w:lang w:val="en-IN"/>
+        </w:rPr>
+        <w:t>Authors' contributions:</w:t>
+      </w:r>
+      <w:r>
+        <w:rPr>
+          <w:lang w:val="en-IN"/>
+        </w:rPr>
+        <w:t xml:space="preserve"> Nayan Sharma contributed to conceptualization, methodology, software development, data curation, experimentation, analysis, and manuscript preparation.</w:t>
+      </w:r>
+      <w:r>
+        <w:rPr>
+          <w:lang w:val="en-IN"/>
+        </w:rPr>
+        <w:t xml:space="preserve"> The</w:t>
+      </w:r>
+      <w:r>
+        <w:rPr>
+          <w:lang w:val="en-IN"/>
+        </w:rPr>
+        <w:t xml:space="preserve"> author reviewed and approved the final manuscript.</w:t>
+      </w:r>
+    </w:p>
+    <w:p>
+      <w:pPr>
+        <w:spacing w:after="40"/>
+        <w:rPr>
+          <w:lang w:val="en-IN"/>
+        </w:rPr>
+      </w:pPr>
+      <w:r>
+        <w:rPr>
+          <w:b/>
+          <w:bCs/>
+          <w:lang w:val="en-IN"/>
+        </w:rPr>
+        <w:t>Acknowledgements:</w:t>
+      </w:r>
+      <w:r>
+        <w:rPr>
+          <w:lang w:val="en-IN"/>
+        </w:rPr>
+        <w:t xml:space="preserve"> The authors acknowledge Vellore Institute of Technology for providing the academic environment in which this research was conducted.</w:t>
+      </w:r>
+    </w:p>
+    <w:p>
+      <w:pPr>
+        <w:spacing w:after="40"/>
+        <w:rPr>
+          <w:lang w:val="en-IN"/>
+        </w:rPr>
+      </w:pPr>
     </w:p>
     <w:p>
       <w:pPr>
         <w:spacing w:after="40"/>
       </w:pPr>
       <w:r>
-        <w:t>Conflict of Interest: The authors declare that they have no known competing financial interests or personal relationships that could have appeared to influence the work reported in this paper.</w:t>
-      </w:r>
-    </w:p>
-    <w:p>
-      <w:pPr>
-        <w:spacing w:after="160"/>
-      </w:pPr>
-      <w:r>
-        <w:t>Data Availability: Data and models will be made available upon reasonable request.</w:t>
-      </w:r>
-    </w:p>
-    <w:p>
-      <w:pPr>
-        <w:keepNext/>
-        <w:spacing w:before="240"/>
-      </w:pPr>
-      <w:r>
         <w:rPr>
           <w:b/>
           <w:sz w:val="26"/>
@@ -10378,7 +11342,21 @@
         <w:rPr>
           <w:sz w:val="17"/>
         </w:rPr>
-        <w:t>5. Rayana S, Akoglu L (2015) Collective opinion spam detection: Bridging review, reviewer, and item perspectives. In: Proceedings of the 21st ACM SIGKDD International Conference on Knowledge Discovery and Data Mining, pp 985–994</w:t>
+        <w:t xml:space="preserve">5. Rayana S, </w:t>
+      </w:r>
+      <w:proofErr w:type="spellStart"/>
+      <w:r>
+        <w:rPr>
+          <w:sz w:val="17"/>
+        </w:rPr>
+        <w:t>Akoglu</w:t>
+      </w:r>
+      <w:proofErr w:type="spellEnd"/>
+      <w:r>
+        <w:rPr>
+          <w:sz w:val="17"/>
+        </w:rPr>
+        <w:t xml:space="preserve"> L (2015) Collective opinion spam detection: Bridging review, reviewer, and item perspectives. In: Proceedings of the 21st ACM SIGKDD International Conference on Knowledge Discovery and Data Mining, pp 985–994</w:t>
       </w:r>
     </w:p>
     <w:p>
@@ -10400,7 +11378,22 @@
         <w:rPr>
           <w:sz w:val="17"/>
         </w:rPr>
-        <w:t>7. Liu Z, Luo P, Qiu S, Wang X, Tang X (2016) DeepFashion: Powering large-scale clothing retrieval with deep visual-semantic embeddings. In: Proceedings of the IEEE Conference on Computer Vision and Pattern Recognition (CVPR), pp 1098–1107</w:t>
+        <w:lastRenderedPageBreak/>
+        <w:t xml:space="preserve">7. Liu Z, Luo P, Qiu S, Wang X, Tang X (2016) </w:t>
+      </w:r>
+      <w:proofErr w:type="spellStart"/>
+      <w:r>
+        <w:rPr>
+          <w:sz w:val="17"/>
+        </w:rPr>
+        <w:t>DeepFashion</w:t>
+      </w:r>
+      <w:proofErr w:type="spellEnd"/>
+      <w:r>
+        <w:rPr>
+          <w:sz w:val="17"/>
+        </w:rPr>
+        <w:t>: Powering large-scale clothing retrieval with deep visual-semantic embeddings. In: Proceedings of the IEEE Conference on Computer Vision and Pattern Recognition (CVPR), pp 1098–1107</w:t>
       </w:r>
     </w:p>
     <w:p>
@@ -10411,7 +11404,21 @@
         <w:rPr>
           <w:sz w:val="17"/>
         </w:rPr>
-        <w:t>8. Johnson J, Douze M, Jégou H (2021) Billion-scale similarity search with GPUs. IEEE Trans Big Data 7(3):535–547</w:t>
+        <w:t xml:space="preserve">8. Johnson J, </w:t>
+      </w:r>
+      <w:proofErr w:type="spellStart"/>
+      <w:r>
+        <w:rPr>
+          <w:sz w:val="17"/>
+        </w:rPr>
+        <w:t>Douze</w:t>
+      </w:r>
+      <w:proofErr w:type="spellEnd"/>
+      <w:r>
+        <w:rPr>
+          <w:sz w:val="17"/>
+        </w:rPr>
+        <w:t xml:space="preserve"> M, Jégou H (2021) Billion-scale similarity search with GPUs. IEEE Trans Big Data 7(3):535–547</w:t>
       </w:r>
     </w:p>
     <w:p>
@@ -10422,7 +11429,21 @@
         <w:rPr>
           <w:sz w:val="17"/>
         </w:rPr>
-        <w:t>9. Baltrušaitis T, Ahuja C, Morency LP (2019) Multimodal machine learning: A survey and taxonomy. IEEE Trans Pattern Anal Mach Intell 41(2):423–443</w:t>
+        <w:t xml:space="preserve">9. </w:t>
+      </w:r>
+      <w:proofErr w:type="spellStart"/>
+      <w:r>
+        <w:rPr>
+          <w:sz w:val="17"/>
+        </w:rPr>
+        <w:t>Baltrušaitis</w:t>
+      </w:r>
+      <w:proofErr w:type="spellEnd"/>
+      <w:r>
+        <w:rPr>
+          <w:sz w:val="17"/>
+        </w:rPr>
+        <w:t xml:space="preserve"> T, Ahuja C, Morency LP (2019) Multimodal machine learning: A survey and taxonomy. IEEE Trans Pattern Anal Mach Intell 41(2):423–443</w:t>
       </w:r>
     </w:p>
     <w:p>
@@ -10433,7 +11454,35 @@
         <w:rPr>
           <w:sz w:val="17"/>
         </w:rPr>
-        <w:t>10. Hochreiter S, Schmidhuber J (1997) Long short-term memory. Neural Comput 9(8):1735–1780</w:t>
+        <w:t xml:space="preserve">10. Hochreiter S, </w:t>
+      </w:r>
+      <w:proofErr w:type="spellStart"/>
+      <w:r>
+        <w:rPr>
+          <w:sz w:val="17"/>
+        </w:rPr>
+        <w:t>Schmidhuber</w:t>
+      </w:r>
+      <w:proofErr w:type="spellEnd"/>
+      <w:r>
+        <w:rPr>
+          <w:sz w:val="17"/>
+        </w:rPr>
+        <w:t xml:space="preserve"> J (1997) Long short-term memory. Neural </w:t>
+      </w:r>
+      <w:proofErr w:type="spellStart"/>
+      <w:r>
+        <w:rPr>
+          <w:sz w:val="17"/>
+        </w:rPr>
+        <w:t>Comput</w:t>
+      </w:r>
+      <w:proofErr w:type="spellEnd"/>
+      <w:r>
+        <w:rPr>
+          <w:sz w:val="17"/>
+        </w:rPr>
+        <w:t xml:space="preserve"> 9(8):1735–1780</w:t>
       </w:r>
     </w:p>
     <w:p>
@@ -10477,7 +11526,21 @@
         <w:rPr>
           <w:sz w:val="17"/>
         </w:rPr>
-        <w:t>14. van der Maaten L, Hinton G (2008) Visualizing data using t-SNE. J Mach Learn Res 9:2579–2605</w:t>
+        <w:t xml:space="preserve">14. van der </w:t>
+      </w:r>
+      <w:proofErr w:type="spellStart"/>
+      <w:r>
+        <w:rPr>
+          <w:sz w:val="17"/>
+        </w:rPr>
+        <w:t>Maaten</w:t>
+      </w:r>
+      <w:proofErr w:type="spellEnd"/>
+      <w:r>
+        <w:rPr>
+          <w:sz w:val="17"/>
+        </w:rPr>
+        <w:t xml:space="preserve"> L, Hinton G (2008) Visualizing data using t-SNE. J Mach Learn Res 9:2579–2605</w:t>
       </w:r>
     </w:p>
     <w:p>
@@ -10488,7 +11551,35 @@
         <w:rPr>
           <w:sz w:val="17"/>
         </w:rPr>
-        <w:t>15. Akoglu L, Chandy R, Faloutsos C (2013) Opinion fraud detection in online reviews by network analysis. In: Proceedings of the International AAAI Conference on Web and Social Media (ICWSM) 7(1):17–26</w:t>
+        <w:t xml:space="preserve">15. </w:t>
+      </w:r>
+      <w:proofErr w:type="spellStart"/>
+      <w:r>
+        <w:rPr>
+          <w:sz w:val="17"/>
+        </w:rPr>
+        <w:t>Akoglu</w:t>
+      </w:r>
+      <w:proofErr w:type="spellEnd"/>
+      <w:r>
+        <w:rPr>
+          <w:sz w:val="17"/>
+        </w:rPr>
+        <w:t xml:space="preserve"> L, Chandy R, </w:t>
+      </w:r>
+      <w:proofErr w:type="spellStart"/>
+      <w:r>
+        <w:rPr>
+          <w:sz w:val="17"/>
+        </w:rPr>
+        <w:t>Faloutsos</w:t>
+      </w:r>
+      <w:proofErr w:type="spellEnd"/>
+      <w:r>
+        <w:rPr>
+          <w:sz w:val="17"/>
+        </w:rPr>
+        <w:t xml:space="preserve"> C (2013) Opinion fraud detection in online reviews by network analysis. In: Proceedings of the International AAAI Conference on Web and Social Media (ICWSM) 7(1):17–26</w:t>
       </w:r>
     </w:p>
     <w:p>
@@ -11325,7 +12416,6 @@
   <w:style w:type="character" w:default="1" w:styleId="DefaultParagraphFont">
     <w:name w:val="Default Paragraph Font"/>
     <w:uiPriority w:val="1"/>
-    <w:semiHidden/>
     <w:unhideWhenUsed/>
   </w:style>
   <w:style w:type="table" w:default="1" w:styleId="TableNormal">
@@ -22102,6 +23192,19 @@
       </w:tcPr>
     </w:tblStylePr>
   </w:style>
+  <w:style w:type="paragraph" w:styleId="NormalWeb">
+    <w:name w:val="Normal (Web)"/>
+    <w:basedOn w:val="Normal"/>
+    <w:uiPriority w:val="99"/>
+    <w:semiHidden/>
+    <w:unhideWhenUsed/>
+    <w:rsid w:val="00191026"/>
+    <w:rPr>
+      <w:rFonts w:cs="Times New Roman"/>
+      <w:sz w:val="24"/>
+      <w:szCs w:val="24"/>
+    </w:rPr>
+  </w:style>
 </w:styles>
 </file>
 

</xml_diff>